<commit_message>
Obj4 manuscript v2: peer review, integrity audit, validity analyses, 41 verified references
- Add HTMT, nested CFA and second-order model (validity_extra.py)
- Rewrite manuscript; fix wrong/unsupported citations; zero orphan references
- Add review and integrity report

Co-Authored-By: Claude Opus 5.5 <noreply@anthropic.com>
Claude-Session: https://claude.ai/code/session_011ijdXe2nvHH3sMWrXWSiXn
</commit_message>
<xml_diff>
--- a/output/obj4/Obj4_Perception_manuscript.docx
+++ b/output/obj4/Obj4_Perception_manuscript.docx
@@ -60,7 +60,7 @@
         <w:rPr>
           <w:i/>
         </w:rPr>
-        <w:t>Target journal: Urban Forestry &amp; Urban Greening (Elsevier). Formatting follows that journal's structure (Highlights, structured sections, CRediT, declarations). Author order, affiliations and the declarations marked [CONFIRM] are for the authors to confirm.</w:t>
+        <w:t>Prepared for Urban Forestry &amp; Urban Greening (Elsevier). Items marked [CONFIRM] need an author decision before submission.</w:t>
       </w:r>
     </w:p>
     <w:p>
@@ -84,7 +84,7 @@
         <w:pStyle w:val="ListBullet"/>
       </w:pPr>
       <w:r>
-        <w:t>A five-dimension perception instrument showed good fit and reliability (CFI = 0.99).</w:t>
+        <w:t>A five-factor, second-order perception model fitted well (CFI = 0.988, HTMT ≤ 0.74).</w:t>
       </w:r>
     </w:p>
     <w:p>
@@ -92,7 +92,7 @@
         <w:pStyle w:val="ListBullet"/>
       </w:pPr>
       <w:r>
-        <w:t>Environmental benefits were rated highest (73.0/100) and governance lowest (60.3/100).</w:t>
+        <w:t>Environmental benefits scored highest (73.0/100); governance scored lowest (60.3/100).</w:t>
       </w:r>
     </w:p>
     <w:p>
@@ -100,7 +100,7 @@
         <w:pStyle w:val="ListBullet"/>
       </w:pPr>
       <w:r>
-        <w:t>Ecological-function endorsement trailed environmental appreciation (7.3 points; all classes).</w:t>
+        <w:t>Ecological functions were endorsed 7.3 points below environmental benefits.</w:t>
       </w:r>
     </w:p>
     <w:p>
@@ -108,7 +108,7 @@
         <w:pStyle w:val="ListBullet"/>
       </w:pPr>
       <w:r>
-        <w:t>Only class (access) and residence length (governance) effects survived multiple-test correction.</w:t>
+        <w:t>Class shaped access; tenure shaped governance ratings; demographics barely mattered.</w:t>
       </w:r>
     </w:p>
     <w:p>
@@ -121,35 +121,7 @@
     </w:p>
     <w:p>
       <w:r>
-        <w:rPr>
-          <w:b/>
-        </w:rPr>
-        <w:t>Background.</w:t>
-      </w:r>
-      <w:r>
-        <w:t xml:space="preserve"> Cities in the Global South are losing green cover quickly, yet we know little about how residents perceive the different kinds of green space that remain. Perception studies usually treat "green space" as a single category, which hides differences that matter for planning.</w:t>
-      </w:r>
-    </w:p>
-    <w:p>
-      <w:r>
-        <w:rPr>
-          <w:b/>
-        </w:rPr>
-        <w:t>Methods.</w:t>
-      </w:r>
-      <w:r>
-        <w:t xml:space="preserve"> We surveyed 300 adult residents of Bengaluru Urban district with a 35-item questionnaire, in English or Kannada, using Google Forms and face-to-face interviews. Each respondent answered for the class of green space they visit most often, drawn from a seven-class functional typology (urban forest, managed parks, institutional greens, lake-riparian systems, grassland/scrub, neighbourhood parks, avenue plantations). Twenty-nine five-point Likert items formed five dimensions: usage and access, environmental perception, vegetation and climate awareness, soil and ecological function, and governance. We tested dimensionality (CFA, EFA, parallel analysis), reliability, and differences by class and respondent characteristics (Kruskal–Wallis tests with Holm correction across 36 tests). We tested the appreciation–awareness gap with a paired Wilcoxon test and bootstrap confidence intervals.</w:t>
-      </w:r>
-    </w:p>
-    <w:p>
-      <w:r>
-        <w:rPr>
-          <w:b/>
-        </w:rPr>
-        <w:t>Results.</w:t>
-      </w:r>
-      <w:r>
-        <w:t xml:space="preserve"> A five-factor model fitted well (χ²(367) = 406.1, CFI = 0.988, RMSEA = 0.019) and far better than a single factor (CFI = 0.712). Cronbach's α ranged from 0.80 to 0.86. Environmental perception scored highest (73.0 on a 0–100 scale) and governance lowest (60.3). Residents endorsed the ecological functions of green space less strongly than its environmental benefits (gap 7.3 points, 95% CI 5.4–9.3; Wilcoxon </w:t>
+        <w:t xml:space="preserve">Bengaluru has lost much of the green cover that earned it the name Garden City, yet little is known about how residents judge the different kinds of green space left. Most perception studies treat green space as one category. We surveyed 300 adult residents of Bengaluru Urban district with a 35-item questionnaire, given in English or Kannada through Google Forms and face-to-face interviews. Each respondent answered for the class of green space they visit most, chosen from a seven-class functional typology: urban forest, managed parks, institutional greens, lake-riparian systems, grassland/scrub, neighbourhood parks and avenue plantations. Twenty-nine five-point items measured usage and access, environmental perception, vegetation and climate awareness, soil and ecological function, and governance. A five-factor model fitted well (χ²(367) = 406.1, CFI = 0.988, RMSEA = 0.019). It outperformed merged four-factor alternatives (Δχ²(4) ≥ 130.2, </w:t>
       </w:r>
       <w:r>
         <w:rPr>
@@ -158,7 +130,7 @@
         <w:t>p</w:t>
       </w:r>
       <w:r>
-        <w:t xml:space="preserve"> &lt; 0.001; </w:t>
+        <w:t xml:space="preserve"> &lt; 0.001), met the heterotrait–monotrait criterion (all HTMT ≤ 0.74), and supported a second-order composite, the Green Space Perception Index (GSPI = 67.1/100). Residents rated environmental benefits highest (73.0) and governance lowest (60.3). They endorsed ecological functions 7.3 points less than environmental benefits (95% CI 5.4–9.3; </w:t>
       </w:r>
       <w:r>
         <w:rPr>
@@ -167,27 +139,7 @@
         <w:t>d</w:t>
       </w:r>
       <w:r>
-        <w:t>z = 0.42), and the gap was positive in all seven classes. It did not differ significantly among classes (</w:t>
-      </w:r>
-      <w:r>
-        <w:rPr>
-          <w:i/>
-        </w:rPr>
-        <w:t>p</w:t>
-      </w:r>
-      <w:r>
-        <w:t xml:space="preserve"> = 0.40). Of 36 group tests, seven were nominally significant and two survived Holm correction: green-space class affected usage and access (ε² = 0.077; urban forest and grassland/scrub were least accessible), and longer residence was associated with higher governance ratings (ε² = 0.050). Age, gender and occupation showed no detectable effects.</w:t>
-      </w:r>
-    </w:p>
-    <w:p>
-      <w:r>
-        <w:rPr>
-          <w:b/>
-        </w:rPr>
-        <w:t>Conclusions.</w:t>
-      </w:r>
-      <w:r>
-        <w:t xml:space="preserve"> Residents value what green space does for the local environment but rate its management poorly, and they under-endorse its less visible ecological functions. Access, not appreciation, separates the classes. Interventions should target maintenance and visible management first, and should add access and interpretation where urban forest and scrubland are concerned. The sample is quota-balanced and cross-sectional, so the results describe associations in this sample and do not give population prevalence.</w:t>
+        <w:t>z = 0.42), a gap that appeared in every class. Of 36 group comparisons, two survived Holm correction. Class shaped usage and access (ε² = 0.077), with urban forest and grassland/scrub the least reached. Longer residence went with higher governance ratings (ε² = 0.050). Age, gender and occupation showed no effect. The results point to visible management and better access, not persuasion, as the levers that would most change how residents experience the city's green space. The quota sample and cross-sectional design limit generalisation.</w:t>
       </w:r>
     </w:p>
     <w:p>
@@ -198,7 +150,7 @@
         <w:t>Keywords:</w:t>
       </w:r>
       <w:r>
-        <w:t xml:space="preserve"> urban green space typology; public perception; Bengaluru; confirmatory factor analysis; governance; ecosystem awareness; Global South</w:t>
+        <w:t xml:space="preserve"> urban green space typology; public perception; Bengaluru; confirmatory factor analysis; governance; ecosystem services; Global South</w:t>
       </w:r>
     </w:p>
     <w:p>
@@ -211,22 +163,27 @@
     </w:p>
     <w:p>
       <w:r>
-        <w:t>Bengaluru is still called the Garden City, but the label describes its past better than its present. Satellite studies document a steep decline in vegetation cover and a several-fold rise in built-up area over recent decades (Ramachandra et al., 2015; Nagendra et al., 2012), and street-tree surveys show that what remains is unevenly distributed (Nagendra and Gopal, 2010). Whether the remaining green space actually delivers the benefits attributed to it depends partly on how people see it. Residents decide whether to visit a park, whether to support its protection, and whether to trust the authority that manages it. Those decisions rest on perception, so measuring perception is a necessary complement to measuring vegetation.</w:t>
+        <w:t>Between 2000 and 2007 Bangalore's core kept much of its vegetation but broke it into smaller pieces, while the periphery was cleared for building (Nagendra et al., 2012). Street trees are spread unevenly across the city (Nagendra and Gopal, 2010). In parks, large-canopied species are slowly being replaced by smaller ones that are easier to maintain but may not offer the same benefits (Nagendra and Gopal, 2011). Such losses matter because the city's green space still does measurable work. Street trees in Bangalore lower suspended particulate matter and sulphur dioxide (Vailshery et al., 2013). Across 262 green spaces, parks cooled their surroundings by 2.23 °C on average, with the effect reaching up to 347 m (Shah et al., 2021).</w:t>
       </w:r>
     </w:p>
     <w:p>
       <w:r>
-        <w:t>The international evidence is large. Restoration theories hold that natural settings are experienced directly, through their felt environmental quality (Kaplan, 1995; Ulrich et al., 1991). Reviews link green space structure, biodiversity and naturalness to well-being, and note that most studies rely on users' perceptions, so the congruence between perception and objective measurement remains open (Reyes-Riveros et al., 2021). Surveys in Guangzhou found that residents appreciated green space for its microclimate and scenic benefits but gave limited weight to its wider ecological functions (Jim and Chen, 2006). In Bengaluru, work along the rural–urban gradient has related well-being to tree cover (Thapa et al., 2024) and has documented how residents perceive lakes as ecosystem service providers (Plieninger et al., 2022). Equity concerns run through this literature: greening that ignores who can reach and who controls green space risks reproducing disadvantage (Wolch et al., 2014).</w:t>
+        <w:t>Physical benefits only reach people who use the space, value it and back its protection, and all three depend on perception. Restoration theories explain part of the appeal: natural settings help people recover from mental fatigue and stress (Kaplan, 1995; Ulrich et al., 1991). Later work groups the benefits into three pathways — reducing harm, restoring capacities and building new ones through activity and social contact (Markevych et al., 2017; Hartig et al., 2014). Dose matters too. Longer and more frequent visits go with better health (Shanahan et al., 2016), and about two hours a week in nature appears to be a threshold for reported well-being (White et al., 2019). Quality counts as well as quantity: psychological benefit rises with species richness (Fuller et al., 2007), and the quality, accessibility and perceived safety of a space shape whether people use it at all (Lee and Maheswaran, 2011).</w:t>
       </w:r>
     </w:p>
     <w:p>
       <w:r>
-        <w:t>Three gaps limit what this evidence can tell Bengaluru's planners. First, most perception studies treat "green space" as one category, although the term carries different meanings across disciplines and the definition changes what is being compared (Taylor and Hochuli, 2017). A resident answering about Lalbagh and one answering about a roadside avenue are not describing the same thing. Second, perception is often collapsed into a single satisfaction score, although access, environmental experience, ecological understanding and trust in management may behave differently. Third, the instruments are rarely tested for dimensionality, so the reported "dimensions" are assumed and not demonstrated.</w:t>
+        <w:t>Perception surveys have a long record in Asian cities. In Guangzhou, residents emphasised microclimate and scenery and gave little thought to wildlife habitat or species conservation (Jim and Chen, 2006). A later survey there found perceptions differed across most socioeconomic groups (Jim and Shan, 2013). In Hong Kong, the social character of a neighbourhood mattered more than park design in predicting visits (Lo and Jim, 2010). Bengaluru now has its own evidence. Residents along the rural–urban gradient report well-being linked to tree cover (Thapa et al., 2024), and they value lakes for regulating and cultural services, with only small differences between social groups (Plieninger et al., 2022).</w:t>
       </w:r>
     </w:p>
     <w:p>
       <w:r>
-        <w:t>This paper addresses these gaps with a survey in which every respondent answered about one class of a seven-class functional typology of green space, and in which the instrument was tested for its factor structure and reliability before group differences were interpreted. The typology comes from the wider study of which this survey is one component; it divides the district's green space into urban forest, managed parks and botanical gardens, institutional green complexes, lake-riparian systems, grassland and scrubland, neighbourhood and community parks, and avenue plantations. We ask four questions.</w:t>
+        <w:t>Three gaps remain. First, "green space" is defined in incompatible ways across disciplines, sometimes as nature in general and sometimes as urban vegetation only (Taylor and Hochuli, 2017), so most surveys average over very different places. A resident thinking of Lalbagh and one thinking of a roadside avenue aren't describing the same thing. Second, reviews show that the field leans heavily on users' perceptions while rarely checking them against independent physical measures (Reyes-Riveros et al., 2021). Third, perception is often reduced to one satisfaction score, although recent work finds that perceived qualities have an internal structure (Zhou and Tan, 2024), and that visitors' judgements and spatial indicators of the same park can disagree (Kothencz and Blaschke, 2017).</w:t>
+      </w:r>
+    </w:p>
+    <w:p>
+      <w:r>
+        <w:t>We address these gaps with a survey in which every answer is tied to one class of a seven-class functional typology, mapped independently from satellite imagery in the wider study. We also tested the instrument's structure before comparing any groups. Four questions guide the analysis:</w:t>
       </w:r>
     </w:p>
     <w:p>
@@ -240,7 +197,7 @@
         <w:t>RQ1.</w:t>
       </w:r>
       <w:r>
-        <w:t xml:space="preserve"> Does a five-dimension structure (usage and access, environmental perception, vegetation and climate awareness, soil and ecological function, governance) describe the data, and are the dimensions reliable?</w:t>
+        <w:t xml:space="preserve"> Do five related but distinct dimensions — usage and access, environmental perception, vegetation and climate awareness, soil and ecological function, and governance — describe residents' answers, and can they be combined into one index?</w:t>
       </w:r>
     </w:p>
     <w:p>
@@ -254,7 +211,7 @@
         <w:t>RQ2.</w:t>
       </w:r>
       <w:r>
-        <w:t xml:space="preserve"> How do residents rate the five dimensions overall?</w:t>
+        <w:t xml:space="preserve"> How do residents rate the five dimensions?</w:t>
       </w:r>
     </w:p>
     <w:p>
@@ -268,7 +225,7 @@
         <w:t>RQ3.</w:t>
       </w:r>
       <w:r>
-        <w:t xml:space="preserve"> Do ratings differ by green-space class and by respondent characteristics, once multiple testing is accounted for?</w:t>
+        <w:t xml:space="preserve"> Which differences by green-space class and respondent characteristics survive correction for multiple testing?</w:t>
       </w:r>
     </w:p>
     <w:p>
@@ -282,12 +239,12 @@
         <w:t>RQ4.</w:t>
       </w:r>
       <w:r>
-        <w:t xml:space="preserve"> Do residents endorse the ecological functions of green space less than its visible environmental benefits, and does that gap differ among classes?</w:t>
+        <w:t xml:space="preserve"> Do residents endorse the ecological functions of green space less than its visible environmental benefits, and does that gap vary by class?</w:t>
       </w:r>
     </w:p>
     <w:p>
       <w:r>
-        <w:t>Our working expectation, drawn from Jim and Chen (2006), was that appreciation would exceed ecological awareness (H4 of the wider study). We had no directional expectation for the class differences, and we treated the demographic comparisons as exploratory.</w:t>
+        <w:t>Following Jim and Chen (2006), we expected environmental appreciation to exceed ecological-function endorsement. We had no directional prediction for class, and we treated the demographic comparisons as exploratory.</w:t>
       </w:r>
     </w:p>
     <w:p>
@@ -303,12 +260,73 @@
         <w:pStyle w:val="Heading2"/>
       </w:pPr>
       <w:r>
-        <w:t>2.1 Study area and green-space typology</w:t>
+        <w:t>2.1 Study area and typology</w:t>
       </w:r>
     </w:p>
     <w:p>
       <w:r>
-        <w:t>The study covers Bengaluru Urban district in Karnataka, southern India (about 12.97° N, 77.59° E; about 800–960 m above sea level), a district that spans the dense urban core, the peri-urban transition and an agricultural and scrub-dominated fringe. Its population exceeded nine million at the 2011 Census. Green space was classified into seven functional classes from Sentinel-2 imagery in a companion analysis: Class I, urban forest and reserved natural systems; Class II, managed public parks and botanical gardens; Class III, institutional green complexes; Class IV, lake-riparian and blue-green systems; Class V, grassland and scrubland; Class VI, neighbourhood and community parks; and Class VII, avenue plantations and linear greens. The questionnaire gave each class a plain-language description with local examples (for instance, Turahalli for Class I, Lalbagh and Cubbon Park for Class II, and Sankey Tank and Agara Lake for Class IV), so that respondents could place their own most-visited green space into a class without technical knowledge.</w:t>
+        <w:t>Bengaluru Urban district (about 12.97° N, 77.59° E; 800–960 m above sea level) runs from a dense urban core through a peri-urban belt to an agricultural and scrub fringe. Its population passed nine million at the 2011 Census. A companion analysis classified the district's green space from Sentinel-2 imagery into seven functional classes:</w:t>
+      </w:r>
+    </w:p>
+    <w:p>
+      <w:pPr>
+        <w:pStyle w:val="ListBullet"/>
+      </w:pPr>
+      <w:r>
+        <w:t>I, urban forest and reserved natural systems</w:t>
+      </w:r>
+    </w:p>
+    <w:p>
+      <w:pPr>
+        <w:pStyle w:val="ListBullet"/>
+      </w:pPr>
+      <w:r>
+        <w:t>II, managed public parks and botanical gardens</w:t>
+      </w:r>
+    </w:p>
+    <w:p>
+      <w:pPr>
+        <w:pStyle w:val="ListBullet"/>
+      </w:pPr>
+      <w:r>
+        <w:t>III, institutional green complexes</w:t>
+      </w:r>
+    </w:p>
+    <w:p>
+      <w:pPr>
+        <w:pStyle w:val="ListBullet"/>
+      </w:pPr>
+      <w:r>
+        <w:t>IV, lake-riparian and blue-green systems</w:t>
+      </w:r>
+    </w:p>
+    <w:p>
+      <w:pPr>
+        <w:pStyle w:val="ListBullet"/>
+      </w:pPr>
+      <w:r>
+        <w:t>V, grassland and scrubland</w:t>
+      </w:r>
+    </w:p>
+    <w:p>
+      <w:pPr>
+        <w:pStyle w:val="ListBullet"/>
+      </w:pPr>
+      <w:r>
+        <w:t>VI, neighbourhood and community parks</w:t>
+      </w:r>
+    </w:p>
+    <w:p>
+      <w:pPr>
+        <w:pStyle w:val="ListBullet"/>
+      </w:pPr>
+      <w:r>
+        <w:t>VII, avenue plantations and linear greens</w:t>
+      </w:r>
+    </w:p>
+    <w:p>
+      <w:r>
+        <w:t>These classes fit within the planning-oriented groupings of urban ecosystem services described by Gómez-Baggethun and Barton (2013). The questionnaire described each class in plain language with familiar examples — Turahalli for Class I, Lalbagh and Cubbon Park for Class II, Sankey Tank and Agara Lake for Class IV — so that people without technical training could place the space they use most.</w:t>
       </w:r>
     </w:p>
     <w:p>
@@ -321,12 +339,59 @@
     </w:p>
     <w:p>
       <w:r>
-        <w:t>The questionnaire (35 items) had a short consent statement followed by five parts. Part A recorded five demographic variables: age group, gender, education, occupation and length of residence in Bengaluru. Section 1 asked respondents to select the one class of green space they visit most often (Q6) and then rated five usage and access statements (Q7–Q11). Sections 2 to 5 contained six statements each: environmental perception (Q12–Q17), vegetation and climate awareness (Q18–Q23), soil and ecological function awareness (Q24–Q29) and governance, management and threat perception (Q30–Q35). All 29 statements used a five-point agreement scale (1 = strongly disagree to 5 = strongly agree; Likert, 1932), with "neutral/unsure" as the midpoint. Respondents were told to answer for the one class they had chosen. The English questionnaire was also administered in Kannada. Items were worded positively; no item was reverse-keyed. The full item wording is given in Supplementary Table S1.</w:t>
+        <w:t>The questionnaire opened with a consent statement and had five parts.</w:t>
       </w:r>
     </w:p>
     <w:p>
-      <w:r>
-        <w:t>Item Q31 ("Urban development threatens green spaces") and items Q34 and Q35 (support for conservation; improved management would help) measure threat awareness and willingness rather than an evaluation of current management. We kept them in the governance dimension, as the instrument was designed, and checked the effect of removing them (Section 3.6).</w:t>
+      <w:pPr>
+        <w:pStyle w:val="ListBullet"/>
+      </w:pPr>
+      <w:r>
+        <w:rPr>
+          <w:b/>
+        </w:rPr>
+        <w:t>Part A</w:t>
+      </w:r>
+      <w:r>
+        <w:t xml:space="preserve"> recorded age, gender, education, occupation and length of residence in Bengaluru.</w:t>
+      </w:r>
+    </w:p>
+    <w:p>
+      <w:pPr>
+        <w:pStyle w:val="ListBullet"/>
+      </w:pPr>
+      <w:r>
+        <w:rPr>
+          <w:b/>
+        </w:rPr>
+        <w:t>Section 1</w:t>
+      </w:r>
+      <w:r>
+        <w:t xml:space="preserve"> asked respondents to pick the one class they visit most often (Q6) and then to rate five usage and access statements (Q7–Q11).</w:t>
+      </w:r>
+    </w:p>
+    <w:p>
+      <w:pPr>
+        <w:pStyle w:val="ListBullet"/>
+      </w:pPr>
+      <w:r>
+        <w:rPr>
+          <w:b/>
+        </w:rPr>
+        <w:t>Sections 2 to 5</w:t>
+      </w:r>
+      <w:r>
+        <w:t xml:space="preserve"> held six statements each: environmental perception (Q12–Q17), vegetation and climate awareness (Q18–Q23), soil and ecological function (Q24–Q29), and governance, management and threat perception (Q30–Q35).</w:t>
+      </w:r>
+    </w:p>
+    <w:p>
+      <w:r>
+        <w:t>Every statement used a five-point agreement scale from 1 (strongly disagree) to 5 (strongly agree), with "neutral/unsure" in the middle (Likert, 1932). Respondents answered for the class they had chosen. The questionnaire was given in English or Kannada. All items were positively worded. Supplementary Table S1 lists them in full.</w:t>
+      </w:r>
+    </w:p>
+    <w:p>
+      <w:r>
+        <w:t>Three governance items don't rate current management. Q31 (urban development threatens green spaces) taps perceived threat, and Q34–Q35 tap willingness to support conservation and better management. We kept them as designed and tested whether the results depend on them (Section 3.6).</w:t>
       </w:r>
     </w:p>
     <w:p>
@@ -339,12 +404,49 @@
     </w:p>
     <w:p>
       <w:r>
-        <w:t>The survey was a cross-sectional questionnaire study of adult residents of Bengaluru. We used purposive quota sampling to ensure that each group had enough respondents for comparison and that no single group dominated: the quotas were five age bands of 60 respondents each (18–25, 26–35, 36–45, 46–60, above 60), four education levels of 75 each, five occupation groups of 60 each (student, private sector, public sector, self-employed, retired), and a 60:40 male-to-female ratio (180 men, 120 women). Length of residence and green-space class were not under quota; they reflect who responded and which class each respondent chose. The first author collected all 300 responses personally, through an online form (Google Forms) and through face-to-face interviews in which the author read the items and recorded the answers, with the choice of mode and language left to the respondent. No enumerators were employed. [CONFIRM: the split between online and interview responses, and how the quotas were filled, so that this paragraph states them exactly.]</w:t>
+        <w:t>This was a cross-sectional survey of adult residents. Purposive quota sampling gave each comparison group enough people and stopped any one group dominating. The quotas were:</w:t>
       </w:r>
     </w:p>
     <w:p>
-      <w:r>
-        <w:t>The quota design trades representativeness for balanced comparison. The sample is not representative of Bengaluru's population; it over-represents older age groups, postgraduate and doctoral respondents and the retired relative to the city, and results are not weighted. We therefore read prevalence figures (for example, percentage agreeing) as descriptions of this sample, and we emphasise differences between groups and dimensions over absolute levels.</w:t>
+      <w:pPr>
+        <w:pStyle w:val="ListBullet"/>
+      </w:pPr>
+      <w:r>
+        <w:t>five age bands of 60 respondents (18–25, 26–35, 36–45, 46–60, over 60)</w:t>
+      </w:r>
+    </w:p>
+    <w:p>
+      <w:pPr>
+        <w:pStyle w:val="ListBullet"/>
+      </w:pPr>
+      <w:r>
+        <w:t>four education levels of 75 respondents</w:t>
+      </w:r>
+    </w:p>
+    <w:p>
+      <w:pPr>
+        <w:pStyle w:val="ListBullet"/>
+      </w:pPr>
+      <w:r>
+        <w:t>five occupation groups of 60 respondents (student, private sector, public sector, self-employed, retired)</w:t>
+      </w:r>
+    </w:p>
+    <w:p>
+      <w:pPr>
+        <w:pStyle w:val="ListBullet"/>
+      </w:pPr>
+      <w:r>
+        <w:t>180 men and 120 women</w:t>
+      </w:r>
+    </w:p>
+    <w:p>
+      <w:r>
+        <w:t>Length of residence and class were not controlled; they reflect who took part and what they chose. The first author collected all 300 responses in person, either through Google Forms or in face-to-face interviews, in which the author read out the items and recorded the answers. Respondents chose the mode and the language. No enumerators were used. [CONFIRM: online/interview split, how quotas were filled, fieldwork period.]</w:t>
+      </w:r>
+    </w:p>
+    <w:p>
+      <w:r>
+        <w:t>The quotas buy balanced comparisons at the price of representativeness. Older people, people with postgraduate or doctoral degrees, and retired people are over-represented relative to the city, and no weights were applied. We therefore read levels such as percentage agreement as descriptions of this sample only. Our emphasis falls on contrasts between dimensions and groups.</w:t>
       </w:r>
     </w:p>
     <w:p>
@@ -357,7 +459,7 @@
     </w:p>
     <w:p>
       <w:r>
-        <w:t>Participation was voluntary and anonymous. The questionnaire opened with an information and consent statement, and no names, contact details or other personal identifiers were collected. The questions concerned opinions about green space and basic demographic categories and contained no sensitive, health or personal-history items. Formal approval from an institutional ethics committee was not sought for this survey. [CONFIRM: check whether the target journal accepts this statement; Elsevier journals often require either approval or an explicit exemption statement from the institution.]</w:t>
+        <w:t>Participation was voluntary and anonymous. The consent statement came first, and no names, contact details or other identifiers were recorded. The items covered opinions about green space and broad demographic categories, with no sensitive, health or personal-history questions. Formal approval from an institutional ethics committee was not sought. [CONFIRM against journal policy; an institutional exemption letter is advisable.]</w:t>
       </w:r>
     </w:p>
     <w:p>
@@ -370,7 +472,7 @@
     </w:p>
     <w:p>
       <w:r>
-        <w:t>For each respondent we calculated five dimension indexes as the mean of the items in each dimension (Q7–Q11, Q12–Q17, Q18–Q23, Q24–Q29, Q30–Q35). The Green Space Perception Index (GSPI) is the mean of the five dimension indexes. Indexes were rescaled to 0–100 as (mean − 1) / 4 × 100 so that dimensions read on a common scale. There were no missing responses, no respondent gave the same answer to all 29 items, and there were no duplicate response patterns.</w:t>
+        <w:t>Each dimension index is the mean of its items. The Green Space Perception Index (GSPI) is the mean of the five dimension indexes. All indexes were rescaled to 0–100 as (mean − 1)/4 × 100. The data had no missing values, no respondent gave the same answer to all 29 items, and no response pattern was duplicated.</w:t>
       </w:r>
     </w:p>
     <w:p>
@@ -386,10 +488,57 @@
         <w:rPr>
           <w:b/>
         </w:rPr>
-        <w:t>Dimensionality and reliability.</w:t>
-      </w:r>
-      <w:r>
-        <w:t xml:space="preserve"> We examined factorability with the Kaiser–Meyer–Olkin (KMO) measure (Kaiser, 1974) and Bartlett's test. We extracted components from the correlation matrix, retained them by the Kaiser criterion and by Horn's (1965) parallel analysis (500 random datasets, 95th percentile), and rotated them by varimax. We then fitted a five-factor confirmatory factor analysis (CFA; each item loading on its designed factor, factors correlated, maximum likelihood) and compared it with a single-factor model. We judged fit by χ²/df, CFI, TLI, RMSEA and SRMR against conventional cut-offs (Hu and Bentler, 1999). We report Cronbach's α (Cronbach, 1951), McDonald's ω and average variance extracted (AVE) for each dimension, and we checked discriminant validity with the Fornell–Larcker criterion (Fornell and Larcker, 1981). As a screen for common-method variance we report the share of variance carried by the first unrotated component (Podsakoff et al., 2003).</w:t>
+        <w:t>Structure and reliability.</w:t>
+      </w:r>
+      <w:r>
+        <w:t xml:space="preserve"> We checked factorability with the Kaiser–Meyer–Olkin measure (Kaiser, 1974) and Bartlett's test. Components were extracted from the correlation matrix and compared against Horn's (1965) parallel analysis (500 random datasets, 95th percentile), then rotated by varimax.</w:t>
+      </w:r>
+    </w:p>
+    <w:p>
+      <w:r>
+        <w:t>We then fitted five confirmatory factor analysis (CFA) models by maximum likelihood:</w:t>
+      </w:r>
+    </w:p>
+    <w:p>
+      <w:pPr>
+        <w:pStyle w:val="ListBullet"/>
+      </w:pPr>
+      <w:r>
+        <w:t>the designed five-factor model</w:t>
+      </w:r>
+    </w:p>
+    <w:p>
+      <w:pPr>
+        <w:pStyle w:val="ListBullet"/>
+      </w:pPr>
+      <w:r>
+        <w:t>a single-factor model</w:t>
+      </w:r>
+    </w:p>
+    <w:p>
+      <w:pPr>
+        <w:pStyle w:val="ListBullet"/>
+      </w:pPr>
+      <w:r>
+        <w:t>two four-factor models that merged the most strongly related pairs</w:t>
+      </w:r>
+    </w:p>
+    <w:p>
+      <w:pPr>
+        <w:pStyle w:val="ListBullet"/>
+      </w:pPr>
+      <w:r>
+        <w:t>a second-order model in which one general factor explains the five dimensions</w:t>
+      </w:r>
+    </w:p>
+    <w:p>
+      <w:r>
+        <w:t>Nested models were compared by χ² difference and all models by AIC and BIC. Fit was judged against the cut-offs of Hu and Bentler (1999).</w:t>
+      </w:r>
+    </w:p>
+    <w:p>
+      <w:r>
+        <w:t>Reliability was summarised by Cronbach's α (Cronbach, 1951) and McDonald's ω, which relaxes α's equal-loading assumption (Hayes and Coutts, 2020). Convergent validity was summarised by average variance extracted (AVE). Discriminant validity was checked two ways: with the Fornell–Larcker criterion (Fornell and Larcker, 1981), and with the heterotrait–monotrait ratio (HTMT), which detects a lack of discriminant validity more reliably (Henseler et al., 2015), using a 0.85 threshold and a 2,000-resample bootstrap interval. As a rough screen for common-method variance we report the variance carried by the first unrotated component (Podsakoff et al., 2003).</w:t>
       </w:r>
     </w:p>
     <w:p>
@@ -400,7 +549,7 @@
         <w:t>Group differences.</w:t>
       </w:r>
       <w:r>
-        <w:t xml:space="preserve"> Because Likert-derived indexes are ordinal and several are skewed, our primary tests were Kruskal–Wallis tests, with ε² as the effect size (Tomczak and Tomczak, 2014). The confirmatory family was fixed in advance of looking at the results: six grouping variables (class, length of residence, education, age, occupation, gender) crossed with the five dimension indexes and the GSPI, 36 tests in all. We controlled the family-wise error rate with the Holm (1979) procedure and report both raw and adjusted </w:t>
+        <w:t xml:space="preserve"> Likert indexes are ordinal and some are skewed, so our main tests were Kruskal–Wallis tests with ε² as effect size (Tomczak and Tomczak, 2014). The test family was fixed before the results were seen: six grouping variables (class, residence, education, age, occupation, gender) crossed with the five indexes and the GSPI, 36 tests in all. Family-wise error was controlled by the Holm (1979) procedure, and both raw and adjusted </w:t>
       </w:r>
       <w:r>
         <w:rPr>
@@ -409,7 +558,7 @@
         <w:t>p</w:t>
       </w:r>
       <w:r>
-        <w:t>-values. For tests that survived adjustment we ran pairwise Mann–Whitney tests with Holm correction and report rank-biserial correlations. As a robustness check, we regressed the GSPI on all six categorical variables by ordinary least squares with HC3 robust standard errors (treating the index as approximately interval, Norman, 2010).</w:t>
+        <w:t>-values are reported. Effects that survived were followed by pairwise Mann–Whitney tests, Holm-corrected, with rank-biserial correlations. As a robustness check we regressed the GSPI on all six variables by ordinary least squares with HC3 standard errors, treating the index as approximately interval (Norman, 2010).</w:t>
       </w:r>
     </w:p>
     <w:p>
@@ -417,15 +566,15 @@
         <w:rPr>
           <w:b/>
         </w:rPr>
-        <w:t>Appreciation–awareness gap.</w:t>
-      </w:r>
-      <w:r>
-        <w:t xml:space="preserve"> We defined environmental perception (Q12–Q17: cooling, air quality, noise, shade, seasonal moderation, overall quality) as residents' appreciation of the visible benefits of green space, and soil and ecological function (Q24–Q29: soil condition, biodiversity, rainwater absorption, ground cover, ecological benefits beyond recreation, protecting functions) as their endorsement of its ecological functions. The gap is the difference between the two indexes (0–100 scale), tested with a paired Wilcoxon signed-rank test and summarised by its mean and a 5,000-resample percentile bootstrap 95% confidence interval, overall and within each class. We tested whether the gap differed among classes with a Kruskal–Wallis test. The two dimensions contain different items, so the gap measures relative endorsement and not a like-for-like difference in knowledge; the instrument contains no knowledge test.</w:t>
+        <w:t>Salience gap.</w:t>
+      </w:r>
+      <w:r>
+        <w:t xml:space="preserve"> Environmental perception (Q12–Q17: cooling, air quality, noise, shade, seasonal moderation, overall quality) captures the benefits people feel directly. Soil and ecological function (Q24–Q29: soil condition, biodiversity, rainwater absorption, ground cover, benefits beyond recreation, protecting functions) captures endorsement of functions that are harder to see. We call the difference between the two indexes the salience gap. We tested it with a paired Wilcoxon signed-rank test and gave its mean with a 5,000-resample bootstrap 95% interval, overall and by class. A Kruskal–Wallis test asked whether the gap differs among classes. The two dimensions use different items, so the gap compares how strongly people endorse each set. It isn't a test of ecological knowledge, which the instrument doesn't measure.</w:t>
       </w:r>
     </w:p>
     <w:p>
       <w:r>
-        <w:t>All analyses used Python 3.11 (NumPy, SciPy, statsmodels); the CFA was fitted by direct maximum-likelihood minimisation of the model discrepancy function. The analysis script reproduces every number reported here from the response file.</w:t>
+        <w:t>All analyses ran in Python 3.11 (NumPy, SciPy, statsmodels). The CFA models were fitted by direct minimisation of the maximum-likelihood discrepancy function. The scripts reproduce every reported number from the response file.</w:t>
       </w:r>
     </w:p>
     <w:p>
@@ -441,12 +590,12 @@
         <w:pStyle w:val="Heading2"/>
       </w:pPr>
       <w:r>
-        <w:t>3.1 Sample profile</w:t>
+        <w:t>3.1 Sample</w:t>
       </w:r>
     </w:p>
     <w:p>
       <w:r>
-        <w:t>By design, the age bands, education levels and occupation groups were balanced (Table 1). Most respondents (53.0%) had lived in Bengaluru for more than ten years and only 5.0% for less than one year. Managed parks (28.0%) and neighbourhood parks (26.0%) were the classes most often named as the most-visited space; grassland/scrub (6.0%), institutional greens (8.0%) and avenues (8.0%) were named least often. These class sizes are an outcome of respondent choice, not of design, and they limit what we can say about the small classes.</w:t>
+        <w:t>Table 1 shows the sample. Age, education and occupation groups were balanced by design. Just over half the respondents (53.0%) had lived in Bengaluru for more than ten years, and 5.0% for less than one. Managed parks (28.0%) and neighbourhood parks (26.0%) were named most often as the space people use most. Grassland/scrub (6.0%), institutional greens (8.0%) and avenues (8.0%) were named least. Those class sizes came from respondents' own choices, which limits what can be said about the smaller classes.</w:t>
       </w:r>
     </w:p>
     <w:p>
@@ -589,7 +738,7 @@
                 <w:b w:val="0"/>
                 <w:sz w:val="18"/>
               </w:rPr>
-              <w:t>18–25 / 26–35 / 36–45 / 46–60 / above 60</w:t>
+              <w:t>18–25 / 26–35 / 36–45 / 46–60 / over 60</w:t>
             </w:r>
           </w:p>
         </w:tc>
@@ -1501,12 +1650,17 @@
         <w:pStyle w:val="Heading2"/>
       </w:pPr>
       <w:r>
-        <w:t>3.2 Item-level responses</w:t>
+        <w:t>3.2 Item responses</w:t>
       </w:r>
     </w:p>
     <w:p>
       <w:r>
-        <w:t>Across all 29 items and 300 respondents, 58.3% of responses were "agree" or "strongly agree", 29.0% were neutral and 12.8% were "disagree" or "strongly disagree". Item means ranged from 3.37 to 3.94 on the five-point scale, with standard deviations of 0.92 to 1.09 (Supplementary Table S2). The three highest-rated items all belonged to the environmental dimension: overall environmental quality (Q17, M = 3.93), moderation of seasonal conditions (Q16, M = 3.94) and shade (Q15, M = 3.92), each with about 68–70% agreement. The three lowest-rated items were all in the governance dimension: support for conservation initiatives (Q34, M = 3.37; 43.7% agreement), the perceived threat from urban development (Q31, M = 3.39) and the expectation that better management would help (Q35, M = 3.40). Item skewness was small (−0.67 to 0.02), so a ceiling effect is not a concern.</w:t>
+        <w:t>Across the 29 items, 58.3% of answers were "agree" or "strongly agree", 29.0% were neutral and 12.8% disagreed. Item means ran from 3.37 to 3.94, with standard deviations of 0.92–1.09 (Supplementary Table S2). The top three items were all environmental — seasonal moderation (Q16, M = 3.94), overall environmental quality (Q17, M = 3.93) and shade (Q15, M = 3.92), each with 68–70% agreement. The bottom three were all governance items: support for conservation initiatives (Q34, M = 3.37; 43.7% agreement), the threat from urban development (Q31, M = 3.39) and the view that better management would help (Q35, M = 3.40). Skewness stayed between −0.67 and 0.02, so ceiling effects aren't a concern.</w:t>
+      </w:r>
+    </w:p>
+    <w:p>
+      <w:r>
+        <w:t>The Q34 result surprised us. Fewer than half the respondents agreed they would support conservation initiatives, even while most praised what the same spaces do for them.</w:t>
       </w:r>
     </w:p>
     <w:p>
@@ -1514,12 +1668,12 @@
         <w:pStyle w:val="Heading2"/>
       </w:pPr>
       <w:r>
-        <w:t>3.3 Dimensionality and reliability (RQ1)</w:t>
+        <w:t>3.3 Structure and reliability (RQ1)</w:t>
       </w:r>
     </w:p>
     <w:p>
       <w:r>
-        <w:t xml:space="preserve">The correlation matrix was suitable for factor analysis (KMO = 0.928; Bartlett's χ²(406) = 3525.9, </w:t>
+        <w:t xml:space="preserve">The data suited factor analysis (KMO = 0.928; Bartlett's χ²(406) = 3525.9, </w:t>
       </w:r>
       <w:r>
         <w:rPr>
@@ -1528,12 +1682,12 @@
         <w:t>p</w:t>
       </w:r>
       <w:r>
-        <w:t xml:space="preserve"> &lt; 0.001). The first five eigenvalues were 9.37, 2.47, 1.67, 1.63 and 1.21; the Kaiser criterion therefore suggested five components, whereas parallel analysis, which compares each eigenvalue with the 95th percentile of random data (1.71, 1.60, 1.52, 1.46, 1.40), supported four (Fig. S1). The fifth eigenvalue fell below the random-data benchmark by a modest margin. A five-component varimax solution explained 56.4% of the variance and reproduced the designed structure exactly: every item loaded most strongly on its intended component (smallest primary loading 0.51), and no item loaded 0.40 or above on a second component (Supplementary Table S3).</w:t>
+        <w:t xml:space="preserve"> &lt; 0.001). The first five eigenvalues were 9.37, 2.47, 1.67, 1.63 and 1.21. The Kaiser rule pointed to five components. Parallel analysis, a stricter benchmark, pointed to four: the fifth eigenvalue (1.21) fell short of its random-data counterpart (1.40). Even so, a five-component varimax solution explained 56.4% of the variance and recovered the designed structure item for item. Every item loaded highest on its own component (smallest primary loading 0.51), and none loaded 0.40 or more on a second (Supplementary Table S3).</w:t>
       </w:r>
     </w:p>
     <w:p>
       <w:r>
-        <w:t xml:space="preserve">The five-factor CFA fitted the data well (χ²(367) = 406.1, χ²/df = 1.11, CFI = 0.988, TLI = 0.987, RMSEA = 0.019, SRMR = 0.040), and it fitted far better than a single-factor model (χ²(377) = 1312.8, CFI = 0.712, RMSEA = 0.091; Δχ²(10) = 906.7, </w:t>
+        <w:t xml:space="preserve">Confirmatory models settled the question (Table 2). The designed five-factor model fitted well (χ²(367) = 406.1, χ²/df = 1.11, CFI = 0.988, TLI = 0.987, RMSEA = 0.019, SRMR = 0.040). Merging vegetation/climate awareness with soil/ecological function — the pair most likely to collapse — cut CFI to 0.949 and worsened fit sharply (Δχ²(4) = 130.2, </w:t>
       </w:r>
       <w:r>
         <w:rPr>
@@ -1542,21 +1696,21 @@
         <w:t>p</w:t>
       </w:r>
       <w:r>
-        <w:t xml:space="preserve"> &lt; 0.001). The first unrotated component carried 32.3% of the variance, well below the 50% level that would signal a dominant common-method factor, although this screen is crude and does not rule out method variance.</w:t>
-      </w:r>
-    </w:p>
-    <w:p>
-      <w:r>
-        <w:t>All five dimensions were reliable (Table 2). Cronbach's α ran from 0.80 to 0.86 and McDonald's ω matched it; α for the full 29-item scale was 0.92. Standardised CFA loadings ranged from 0.58 to 0.77. AVE was close to or below the usual 0.50 benchmark (0.40–0.52), which is common for Likert scales with moderate loadings but means convergent validity is adequate, not strong. Discriminant validity was only partly established: latent factor correlations ranged from 0.31 to 0.72, and the Fornell–Larcker criterion was not met for every pair, with the largest overlap between vegetation/climate awareness and soil/ecological function (</w:t>
+        <w:t xml:space="preserve"> &lt; 0.001). Merging environmental perception with vegetation awareness did worse still (Δχ²(4) = 155.6, </w:t>
       </w:r>
       <w:r>
         <w:rPr>
           <w:i/>
         </w:rPr>
-        <w:t>r</w:t>
-      </w:r>
-      <w:r>
-        <w:t xml:space="preserve"> = 0.72). We therefore treat the five dimensions as related but separable, and we do not interpret differences between those two in isolation from the others.</w:t>
+        <w:t>p</w:t>
+      </w:r>
+      <w:r>
+        <w:t xml:space="preserve"> &lt; 0.001). A single factor fitted poorly (CFI = 0.712, RMSEA = 0.091). So five factors describe the data better than four, despite the parallel-analysis result. That test is known to be conservative, which is why we read it as a lower bound here.</w:t>
+      </w:r>
+    </w:p>
+    <w:p>
+      <w:r>
+        <w:t>The second-order model fitted almost as well as the first-order one (χ²(372) = 417.8, CFI = 0.986, RMSEA = 0.020) and had the lowest BIC of all models (777.1 against 794.0). Loadings of the five dimensions on the general factor were 0.59 (usage), 0.76 (environment), 0.90 (vegetation), 0.80 (soil) and 0.71 (governance). This gives the GSPI a measurement basis: it summarises a real common factor, not just an average of unrelated scores.</w:t>
       </w:r>
     </w:p>
     <w:p>
@@ -1565,7 +1719,7 @@
           <w:b/>
           <w:sz w:val="19"/>
         </w:rPr>
-        <w:t>Table 2. Reliability and convergent validity of the five dimensions.</w:t>
+        <w:t>Table 2. Comparison of measurement models (N = 300).</w:t>
       </w:r>
     </w:p>
     <w:tbl>
@@ -1575,17 +1729,911 @@
         <w:tblLook w:firstColumn="1" w:firstRow="1" w:lastColumn="0" w:lastRow="0" w:noHBand="0" w:noVBand="1" w:val="04A0"/>
       </w:tblPr>
       <w:tblGrid>
-        <w:gridCol w:w="1605"/>
-        <w:gridCol w:w="1605"/>
-        <w:gridCol w:w="1605"/>
-        <w:gridCol w:w="1605"/>
-        <w:gridCol w:w="1605"/>
-        <w:gridCol w:w="1605"/>
+        <w:gridCol w:w="1376"/>
+        <w:gridCol w:w="1376"/>
+        <w:gridCol w:w="1376"/>
+        <w:gridCol w:w="1376"/>
+        <w:gridCol w:w="1376"/>
+        <w:gridCol w:w="1376"/>
+        <w:gridCol w:w="1376"/>
       </w:tblGrid>
       <w:tr>
         <w:tc>
           <w:tcPr>
-            <w:tcW w:type="dxa" w:w="1605"/>
+            <w:tcW w:type="dxa" w:w="1376"/>
+          </w:tcPr>
+          <w:p>
+            <w:r>
+              <w:rPr>
+                <w:b/>
+                <w:sz w:val="18"/>
+              </w:rPr>
+            </w:r>
+            <w:r>
+              <w:rPr>
+                <w:b/>
+                <w:sz w:val="18"/>
+              </w:rPr>
+              <w:t>Model</w:t>
+            </w:r>
+          </w:p>
+        </w:tc>
+        <w:tc>
+          <w:tcPr>
+            <w:tcW w:type="dxa" w:w="1376"/>
+          </w:tcPr>
+          <w:p>
+            <w:r>
+              <w:rPr>
+                <w:b/>
+                <w:sz w:val="18"/>
+              </w:rPr>
+            </w:r>
+            <w:r>
+              <w:rPr>
+                <w:b/>
+                <w:sz w:val="18"/>
+              </w:rPr>
+              <w:t>χ²</w:t>
+            </w:r>
+          </w:p>
+        </w:tc>
+        <w:tc>
+          <w:tcPr>
+            <w:tcW w:type="dxa" w:w="1376"/>
+          </w:tcPr>
+          <w:p>
+            <w:r>
+              <w:rPr>
+                <w:b/>
+                <w:sz w:val="18"/>
+              </w:rPr>
+            </w:r>
+            <w:r>
+              <w:rPr>
+                <w:b/>
+                <w:sz w:val="18"/>
+              </w:rPr>
+              <w:t>df</w:t>
+            </w:r>
+          </w:p>
+        </w:tc>
+        <w:tc>
+          <w:tcPr>
+            <w:tcW w:type="dxa" w:w="1376"/>
+          </w:tcPr>
+          <w:p>
+            <w:r>
+              <w:rPr>
+                <w:b/>
+                <w:sz w:val="18"/>
+              </w:rPr>
+            </w:r>
+            <w:r>
+              <w:rPr>
+                <w:b/>
+                <w:sz w:val="18"/>
+              </w:rPr>
+              <w:t>CFI</w:t>
+            </w:r>
+          </w:p>
+        </w:tc>
+        <w:tc>
+          <w:tcPr>
+            <w:tcW w:type="dxa" w:w="1376"/>
+          </w:tcPr>
+          <w:p>
+            <w:r>
+              <w:rPr>
+                <w:b/>
+                <w:sz w:val="18"/>
+              </w:rPr>
+            </w:r>
+            <w:r>
+              <w:rPr>
+                <w:b/>
+                <w:sz w:val="18"/>
+              </w:rPr>
+              <w:t>RMSEA</w:t>
+            </w:r>
+          </w:p>
+        </w:tc>
+        <w:tc>
+          <w:tcPr>
+            <w:tcW w:type="dxa" w:w="1376"/>
+          </w:tcPr>
+          <w:p>
+            <w:r>
+              <w:rPr>
+                <w:b/>
+                <w:sz w:val="18"/>
+              </w:rPr>
+            </w:r>
+            <w:r>
+              <w:rPr>
+                <w:b/>
+                <w:sz w:val="18"/>
+              </w:rPr>
+              <w:t>AIC</w:t>
+            </w:r>
+          </w:p>
+        </w:tc>
+        <w:tc>
+          <w:tcPr>
+            <w:tcW w:type="dxa" w:w="1376"/>
+          </w:tcPr>
+          <w:p>
+            <w:r>
+              <w:rPr>
+                <w:b/>
+                <w:sz w:val="18"/>
+              </w:rPr>
+            </w:r>
+            <w:r>
+              <w:rPr>
+                <w:b/>
+                <w:sz w:val="18"/>
+              </w:rPr>
+              <w:t>BIC</w:t>
+            </w:r>
+          </w:p>
+        </w:tc>
+      </w:tr>
+      <w:tr>
+        <w:tc>
+          <w:tcPr>
+            <w:tcW w:type="dxa" w:w="1376"/>
+          </w:tcPr>
+          <w:p>
+            <w:r>
+              <w:rPr>
+                <w:b w:val="0"/>
+                <w:sz w:val="18"/>
+              </w:rPr>
+            </w:r>
+            <w:r>
+              <w:rPr>
+                <w:b w:val="0"/>
+                <w:sz w:val="18"/>
+              </w:rPr>
+              <w:t>Five correlated factors (designed)</w:t>
+            </w:r>
+          </w:p>
+        </w:tc>
+        <w:tc>
+          <w:tcPr>
+            <w:tcW w:type="dxa" w:w="1376"/>
+          </w:tcPr>
+          <w:p>
+            <w:r>
+              <w:rPr>
+                <w:b w:val="0"/>
+                <w:sz w:val="18"/>
+              </w:rPr>
+            </w:r>
+            <w:r>
+              <w:rPr>
+                <w:b w:val="0"/>
+                <w:sz w:val="18"/>
+              </w:rPr>
+              <w:t>406.1</w:t>
+            </w:r>
+          </w:p>
+        </w:tc>
+        <w:tc>
+          <w:tcPr>
+            <w:tcW w:type="dxa" w:w="1376"/>
+          </w:tcPr>
+          <w:p>
+            <w:r>
+              <w:rPr>
+                <w:b w:val="0"/>
+                <w:sz w:val="18"/>
+              </w:rPr>
+            </w:r>
+            <w:r>
+              <w:rPr>
+                <w:b w:val="0"/>
+                <w:sz w:val="18"/>
+              </w:rPr>
+              <w:t>367</w:t>
+            </w:r>
+          </w:p>
+        </w:tc>
+        <w:tc>
+          <w:tcPr>
+            <w:tcW w:type="dxa" w:w="1376"/>
+          </w:tcPr>
+          <w:p>
+            <w:r>
+              <w:rPr>
+                <w:b w:val="0"/>
+                <w:sz w:val="18"/>
+              </w:rPr>
+            </w:r>
+            <w:r>
+              <w:rPr>
+                <w:b w:val="0"/>
+                <w:sz w:val="18"/>
+              </w:rPr>
+              <w:t>0.988</w:t>
+            </w:r>
+          </w:p>
+        </w:tc>
+        <w:tc>
+          <w:tcPr>
+            <w:tcW w:type="dxa" w:w="1376"/>
+          </w:tcPr>
+          <w:p>
+            <w:r>
+              <w:rPr>
+                <w:b w:val="0"/>
+                <w:sz w:val="18"/>
+              </w:rPr>
+            </w:r>
+            <w:r>
+              <w:rPr>
+                <w:b w:val="0"/>
+                <w:sz w:val="18"/>
+              </w:rPr>
+              <w:t>0.019</w:t>
+            </w:r>
+          </w:p>
+        </w:tc>
+        <w:tc>
+          <w:tcPr>
+            <w:tcW w:type="dxa" w:w="1376"/>
+          </w:tcPr>
+          <w:p>
+            <w:r>
+              <w:rPr>
+                <w:b w:val="0"/>
+                <w:sz w:val="18"/>
+              </w:rPr>
+            </w:r>
+            <w:r>
+              <w:rPr>
+                <w:b w:val="0"/>
+                <w:sz w:val="18"/>
+              </w:rPr>
+              <w:t>542.1</w:t>
+            </w:r>
+          </w:p>
+        </w:tc>
+        <w:tc>
+          <w:tcPr>
+            <w:tcW w:type="dxa" w:w="1376"/>
+          </w:tcPr>
+          <w:p>
+            <w:r>
+              <w:rPr>
+                <w:b w:val="0"/>
+                <w:sz w:val="18"/>
+              </w:rPr>
+            </w:r>
+            <w:r>
+              <w:rPr>
+                <w:b w:val="0"/>
+                <w:sz w:val="18"/>
+              </w:rPr>
+              <w:t>794.0</w:t>
+            </w:r>
+          </w:p>
+        </w:tc>
+      </w:tr>
+      <w:tr>
+        <w:tc>
+          <w:tcPr>
+            <w:tcW w:type="dxa" w:w="1376"/>
+          </w:tcPr>
+          <w:p>
+            <w:r>
+              <w:rPr>
+                <w:b w:val="0"/>
+                <w:sz w:val="18"/>
+              </w:rPr>
+            </w:r>
+            <w:r>
+              <w:rPr>
+                <w:b w:val="0"/>
+                <w:sz w:val="18"/>
+              </w:rPr>
+              <w:t>Second-order (five factors + general)</w:t>
+            </w:r>
+          </w:p>
+        </w:tc>
+        <w:tc>
+          <w:tcPr>
+            <w:tcW w:type="dxa" w:w="1376"/>
+          </w:tcPr>
+          <w:p>
+            <w:r>
+              <w:rPr>
+                <w:b w:val="0"/>
+                <w:sz w:val="18"/>
+              </w:rPr>
+            </w:r>
+            <w:r>
+              <w:rPr>
+                <w:b w:val="0"/>
+                <w:sz w:val="18"/>
+              </w:rPr>
+              <w:t>417.8</w:t>
+            </w:r>
+          </w:p>
+        </w:tc>
+        <w:tc>
+          <w:tcPr>
+            <w:tcW w:type="dxa" w:w="1376"/>
+          </w:tcPr>
+          <w:p>
+            <w:r>
+              <w:rPr>
+                <w:b w:val="0"/>
+                <w:sz w:val="18"/>
+              </w:rPr>
+            </w:r>
+            <w:r>
+              <w:rPr>
+                <w:b w:val="0"/>
+                <w:sz w:val="18"/>
+              </w:rPr>
+              <w:t>372</w:t>
+            </w:r>
+          </w:p>
+        </w:tc>
+        <w:tc>
+          <w:tcPr>
+            <w:tcW w:type="dxa" w:w="1376"/>
+          </w:tcPr>
+          <w:p>
+            <w:r>
+              <w:rPr>
+                <w:b w:val="0"/>
+                <w:sz w:val="18"/>
+              </w:rPr>
+            </w:r>
+            <w:r>
+              <w:rPr>
+                <w:b w:val="0"/>
+                <w:sz w:val="18"/>
+              </w:rPr>
+              <w:t>0.986</w:t>
+            </w:r>
+          </w:p>
+        </w:tc>
+        <w:tc>
+          <w:tcPr>
+            <w:tcW w:type="dxa" w:w="1376"/>
+          </w:tcPr>
+          <w:p>
+            <w:r>
+              <w:rPr>
+                <w:b w:val="0"/>
+                <w:sz w:val="18"/>
+              </w:rPr>
+            </w:r>
+            <w:r>
+              <w:rPr>
+                <w:b w:val="0"/>
+                <w:sz w:val="18"/>
+              </w:rPr>
+              <w:t>0.020</w:t>
+            </w:r>
+          </w:p>
+        </w:tc>
+        <w:tc>
+          <w:tcPr>
+            <w:tcW w:type="dxa" w:w="1376"/>
+          </w:tcPr>
+          <w:p>
+            <w:r>
+              <w:rPr>
+                <w:b w:val="0"/>
+                <w:sz w:val="18"/>
+              </w:rPr>
+            </w:r>
+            <w:r>
+              <w:rPr>
+                <w:b w:val="0"/>
+                <w:sz w:val="18"/>
+              </w:rPr>
+              <w:t>543.8</w:t>
+            </w:r>
+          </w:p>
+        </w:tc>
+        <w:tc>
+          <w:tcPr>
+            <w:tcW w:type="dxa" w:w="1376"/>
+          </w:tcPr>
+          <w:p>
+            <w:r>
+              <w:rPr>
+                <w:b w:val="0"/>
+                <w:sz w:val="18"/>
+              </w:rPr>
+            </w:r>
+            <w:r>
+              <w:rPr>
+                <w:b w:val="0"/>
+                <w:sz w:val="18"/>
+              </w:rPr>
+              <w:t>777.1</w:t>
+            </w:r>
+          </w:p>
+        </w:tc>
+      </w:tr>
+      <w:tr>
+        <w:tc>
+          <w:tcPr>
+            <w:tcW w:type="dxa" w:w="1376"/>
+          </w:tcPr>
+          <w:p>
+            <w:r>
+              <w:rPr>
+                <w:b w:val="0"/>
+                <w:sz w:val="18"/>
+              </w:rPr>
+            </w:r>
+            <w:r>
+              <w:rPr>
+                <w:b w:val="0"/>
+                <w:sz w:val="18"/>
+              </w:rPr>
+              <w:t>Four factors (VEG + SOIL merged)</w:t>
+            </w:r>
+          </w:p>
+        </w:tc>
+        <w:tc>
+          <w:tcPr>
+            <w:tcW w:type="dxa" w:w="1376"/>
+          </w:tcPr>
+          <w:p>
+            <w:r>
+              <w:rPr>
+                <w:b w:val="0"/>
+                <w:sz w:val="18"/>
+              </w:rPr>
+            </w:r>
+            <w:r>
+              <w:rPr>
+                <w:b w:val="0"/>
+                <w:sz w:val="18"/>
+              </w:rPr>
+              <w:t>536.3</w:t>
+            </w:r>
+          </w:p>
+        </w:tc>
+        <w:tc>
+          <w:tcPr>
+            <w:tcW w:type="dxa" w:w="1376"/>
+          </w:tcPr>
+          <w:p>
+            <w:r>
+              <w:rPr>
+                <w:b w:val="0"/>
+                <w:sz w:val="18"/>
+              </w:rPr>
+            </w:r>
+            <w:r>
+              <w:rPr>
+                <w:b w:val="0"/>
+                <w:sz w:val="18"/>
+              </w:rPr>
+              <w:t>371</w:t>
+            </w:r>
+          </w:p>
+        </w:tc>
+        <w:tc>
+          <w:tcPr>
+            <w:tcW w:type="dxa" w:w="1376"/>
+          </w:tcPr>
+          <w:p>
+            <w:r>
+              <w:rPr>
+                <w:b w:val="0"/>
+                <w:sz w:val="18"/>
+              </w:rPr>
+            </w:r>
+            <w:r>
+              <w:rPr>
+                <w:b w:val="0"/>
+                <w:sz w:val="18"/>
+              </w:rPr>
+              <w:t>0.949</w:t>
+            </w:r>
+          </w:p>
+        </w:tc>
+        <w:tc>
+          <w:tcPr>
+            <w:tcW w:type="dxa" w:w="1376"/>
+          </w:tcPr>
+          <w:p>
+            <w:r>
+              <w:rPr>
+                <w:b w:val="0"/>
+                <w:sz w:val="18"/>
+              </w:rPr>
+            </w:r>
+            <w:r>
+              <w:rPr>
+                <w:b w:val="0"/>
+                <w:sz w:val="18"/>
+              </w:rPr>
+              <w:t>0.039</w:t>
+            </w:r>
+          </w:p>
+        </w:tc>
+        <w:tc>
+          <w:tcPr>
+            <w:tcW w:type="dxa" w:w="1376"/>
+          </w:tcPr>
+          <w:p>
+            <w:r>
+              <w:rPr>
+                <w:b w:val="0"/>
+                <w:sz w:val="18"/>
+              </w:rPr>
+            </w:r>
+            <w:r>
+              <w:rPr>
+                <w:b w:val="0"/>
+                <w:sz w:val="18"/>
+              </w:rPr>
+              <w:t>664.3</w:t>
+            </w:r>
+          </w:p>
+        </w:tc>
+        <w:tc>
+          <w:tcPr>
+            <w:tcW w:type="dxa" w:w="1376"/>
+          </w:tcPr>
+          <w:p>
+            <w:r>
+              <w:rPr>
+                <w:b w:val="0"/>
+                <w:sz w:val="18"/>
+              </w:rPr>
+            </w:r>
+            <w:r>
+              <w:rPr>
+                <w:b w:val="0"/>
+                <w:sz w:val="18"/>
+              </w:rPr>
+              <w:t>901.4</w:t>
+            </w:r>
+          </w:p>
+        </w:tc>
+      </w:tr>
+      <w:tr>
+        <w:tc>
+          <w:tcPr>
+            <w:tcW w:type="dxa" w:w="1376"/>
+          </w:tcPr>
+          <w:p>
+            <w:r>
+              <w:rPr>
+                <w:b w:val="0"/>
+                <w:sz w:val="18"/>
+              </w:rPr>
+            </w:r>
+            <w:r>
+              <w:rPr>
+                <w:b w:val="0"/>
+                <w:sz w:val="18"/>
+              </w:rPr>
+              <w:t>Four factors (ENV + VEG merged)</w:t>
+            </w:r>
+          </w:p>
+        </w:tc>
+        <w:tc>
+          <w:tcPr>
+            <w:tcW w:type="dxa" w:w="1376"/>
+          </w:tcPr>
+          <w:p>
+            <w:r>
+              <w:rPr>
+                <w:b w:val="0"/>
+                <w:sz w:val="18"/>
+              </w:rPr>
+            </w:r>
+            <w:r>
+              <w:rPr>
+                <w:b w:val="0"/>
+                <w:sz w:val="18"/>
+              </w:rPr>
+              <w:t>561.7</w:t>
+            </w:r>
+          </w:p>
+        </w:tc>
+        <w:tc>
+          <w:tcPr>
+            <w:tcW w:type="dxa" w:w="1376"/>
+          </w:tcPr>
+          <w:p>
+            <w:r>
+              <w:rPr>
+                <w:b w:val="0"/>
+                <w:sz w:val="18"/>
+              </w:rPr>
+            </w:r>
+            <w:r>
+              <w:rPr>
+                <w:b w:val="0"/>
+                <w:sz w:val="18"/>
+              </w:rPr>
+              <w:t>371</w:t>
+            </w:r>
+          </w:p>
+        </w:tc>
+        <w:tc>
+          <w:tcPr>
+            <w:tcW w:type="dxa" w:w="1376"/>
+          </w:tcPr>
+          <w:p>
+            <w:r>
+              <w:rPr>
+                <w:b w:val="0"/>
+                <w:sz w:val="18"/>
+              </w:rPr>
+            </w:r>
+            <w:r>
+              <w:rPr>
+                <w:b w:val="0"/>
+                <w:sz w:val="18"/>
+              </w:rPr>
+              <w:t>0.941</w:t>
+            </w:r>
+          </w:p>
+        </w:tc>
+        <w:tc>
+          <w:tcPr>
+            <w:tcW w:type="dxa" w:w="1376"/>
+          </w:tcPr>
+          <w:p>
+            <w:r>
+              <w:rPr>
+                <w:b w:val="0"/>
+                <w:sz w:val="18"/>
+              </w:rPr>
+            </w:r>
+            <w:r>
+              <w:rPr>
+                <w:b w:val="0"/>
+                <w:sz w:val="18"/>
+              </w:rPr>
+              <w:t>0.041</w:t>
+            </w:r>
+          </w:p>
+        </w:tc>
+        <w:tc>
+          <w:tcPr>
+            <w:tcW w:type="dxa" w:w="1376"/>
+          </w:tcPr>
+          <w:p>
+            <w:r>
+              <w:rPr>
+                <w:b w:val="0"/>
+                <w:sz w:val="18"/>
+              </w:rPr>
+            </w:r>
+            <w:r>
+              <w:rPr>
+                <w:b w:val="0"/>
+                <w:sz w:val="18"/>
+              </w:rPr>
+              <w:t>689.7</w:t>
+            </w:r>
+          </w:p>
+        </w:tc>
+        <w:tc>
+          <w:tcPr>
+            <w:tcW w:type="dxa" w:w="1376"/>
+          </w:tcPr>
+          <w:p>
+            <w:r>
+              <w:rPr>
+                <w:b w:val="0"/>
+                <w:sz w:val="18"/>
+              </w:rPr>
+            </w:r>
+            <w:r>
+              <w:rPr>
+                <w:b w:val="0"/>
+                <w:sz w:val="18"/>
+              </w:rPr>
+              <w:t>926.7</w:t>
+            </w:r>
+          </w:p>
+        </w:tc>
+      </w:tr>
+      <w:tr>
+        <w:tc>
+          <w:tcPr>
+            <w:tcW w:type="dxa" w:w="1376"/>
+          </w:tcPr>
+          <w:p>
+            <w:r>
+              <w:rPr>
+                <w:b w:val="0"/>
+                <w:sz w:val="18"/>
+              </w:rPr>
+            </w:r>
+            <w:r>
+              <w:rPr>
+                <w:b w:val="0"/>
+                <w:sz w:val="18"/>
+              </w:rPr>
+              <w:t>One factor</w:t>
+            </w:r>
+          </w:p>
+        </w:tc>
+        <w:tc>
+          <w:tcPr>
+            <w:tcW w:type="dxa" w:w="1376"/>
+          </w:tcPr>
+          <w:p>
+            <w:r>
+              <w:rPr>
+                <w:b w:val="0"/>
+                <w:sz w:val="18"/>
+              </w:rPr>
+            </w:r>
+            <w:r>
+              <w:rPr>
+                <w:b w:val="0"/>
+                <w:sz w:val="18"/>
+              </w:rPr>
+              <w:t>1312.8</w:t>
+            </w:r>
+          </w:p>
+        </w:tc>
+        <w:tc>
+          <w:tcPr>
+            <w:tcW w:type="dxa" w:w="1376"/>
+          </w:tcPr>
+          <w:p>
+            <w:r>
+              <w:rPr>
+                <w:b w:val="0"/>
+                <w:sz w:val="18"/>
+              </w:rPr>
+            </w:r>
+            <w:r>
+              <w:rPr>
+                <w:b w:val="0"/>
+                <w:sz w:val="18"/>
+              </w:rPr>
+              <w:t>377</w:t>
+            </w:r>
+          </w:p>
+        </w:tc>
+        <w:tc>
+          <w:tcPr>
+            <w:tcW w:type="dxa" w:w="1376"/>
+          </w:tcPr>
+          <w:p>
+            <w:r>
+              <w:rPr>
+                <w:b w:val="0"/>
+                <w:sz w:val="18"/>
+              </w:rPr>
+            </w:r>
+            <w:r>
+              <w:rPr>
+                <w:b w:val="0"/>
+                <w:sz w:val="18"/>
+              </w:rPr>
+              <w:t>0.712</w:t>
+            </w:r>
+          </w:p>
+        </w:tc>
+        <w:tc>
+          <w:tcPr>
+            <w:tcW w:type="dxa" w:w="1376"/>
+          </w:tcPr>
+          <w:p>
+            <w:r>
+              <w:rPr>
+                <w:b w:val="0"/>
+                <w:sz w:val="18"/>
+              </w:rPr>
+            </w:r>
+            <w:r>
+              <w:rPr>
+                <w:b w:val="0"/>
+                <w:sz w:val="18"/>
+              </w:rPr>
+              <w:t>0.091</w:t>
+            </w:r>
+          </w:p>
+        </w:tc>
+        <w:tc>
+          <w:tcPr>
+            <w:tcW w:type="dxa" w:w="1376"/>
+          </w:tcPr>
+          <w:p>
+            <w:r>
+              <w:rPr>
+                <w:b w:val="0"/>
+                <w:sz w:val="18"/>
+              </w:rPr>
+            </w:r>
+            <w:r>
+              <w:rPr>
+                <w:b w:val="0"/>
+                <w:sz w:val="18"/>
+              </w:rPr>
+              <w:t>—</w:t>
+            </w:r>
+          </w:p>
+        </w:tc>
+        <w:tc>
+          <w:tcPr>
+            <w:tcW w:type="dxa" w:w="1376"/>
+          </w:tcPr>
+          <w:p>
+            <w:r>
+              <w:rPr>
+                <w:b w:val="0"/>
+                <w:sz w:val="18"/>
+              </w:rPr>
+            </w:r>
+            <w:r>
+              <w:rPr>
+                <w:b w:val="0"/>
+                <w:sz w:val="18"/>
+              </w:rPr>
+              <w:t>—</w:t>
+            </w:r>
+          </w:p>
+        </w:tc>
+      </w:tr>
+    </w:tbl>
+    <w:p/>
+    <w:p>
+      <w:r>
+        <w:t>The first unrotated component carried 32.3% of the variance, well short of the 50% that would signal a dominant method factor. This screen is blunt, though, and can't rule method variance out.</w:t>
+      </w:r>
+    </w:p>
+    <w:p>
+      <w:r>
+        <w:t>All five dimensions were reliable (Table 3). Cronbach's α ran from 0.80 to 0.86, ω matched α closely, and α for all 29 items was 0.92. Standardised loadings ranged from 0.58 to 0.77. AVE sat near the 0.50 benchmark (0.40–0.52), which is adequate rather than strong for scales with moderate loadings.</w:t>
+      </w:r>
+    </w:p>
+    <w:p>
+      <w:r>
+        <w:t>On discriminant validity the two criteria disagreed. Latent correlations ran from 0.31 to 0.72, and the Fornell–Larcker test failed for the closest pair, vegetation/climate awareness and soil/ecological function. The HTMT criterion, which performs better in simulation (Henseler et al., 2015), was met for every pair: values ran from 0.31 to 0.74, and the bootstrap upper bound for the closest pair was 0.81, below 0.85. Combined with the nested-model tests, we take the five dimensions to be distinct but related, as the second-order model implies.</w:t>
+      </w:r>
+    </w:p>
+    <w:p>
+      <w:r>
+        <w:rPr>
+          <w:b/>
+          <w:sz w:val="19"/>
+        </w:rPr>
+        <w:t>Table 3. Reliability and validity of the five dimensions.</w:t>
+      </w:r>
+    </w:p>
+    <w:tbl>
+      <w:tblPr>
+        <w:tblStyle w:val="LightGrid-Accent1"/>
+        <w:tblW w:type="auto" w:w="0"/>
+        <w:tblLook w:firstColumn="1" w:firstRow="1" w:lastColumn="0" w:lastRow="0" w:noHBand="0" w:noVBand="1" w:val="04A0"/>
+      </w:tblPr>
+      <w:tblGrid>
+        <w:gridCol w:w="1376"/>
+        <w:gridCol w:w="1376"/>
+        <w:gridCol w:w="1376"/>
+        <w:gridCol w:w="1376"/>
+        <w:gridCol w:w="1376"/>
+        <w:gridCol w:w="1376"/>
+        <w:gridCol w:w="1376"/>
+      </w:tblGrid>
+      <w:tr>
+        <w:tc>
+          <w:tcPr>
+            <w:tcW w:type="dxa" w:w="1376"/>
           </w:tcPr>
           <w:p>
             <w:r>
@@ -1605,7 +2653,7 @@
         </w:tc>
         <w:tc>
           <w:tcPr>
-            <w:tcW w:type="dxa" w:w="1605"/>
+            <w:tcW w:type="dxa" w:w="1376"/>
           </w:tcPr>
           <w:p>
             <w:r>
@@ -1625,7 +2673,7 @@
         </w:tc>
         <w:tc>
           <w:tcPr>
-            <w:tcW w:type="dxa" w:w="1605"/>
+            <w:tcW w:type="dxa" w:w="1376"/>
           </w:tcPr>
           <w:p>
             <w:r>
@@ -1645,7 +2693,7 @@
         </w:tc>
         <w:tc>
           <w:tcPr>
-            <w:tcW w:type="dxa" w:w="1605"/>
+            <w:tcW w:type="dxa" w:w="1376"/>
           </w:tcPr>
           <w:p>
             <w:r>
@@ -1665,7 +2713,7 @@
         </w:tc>
         <w:tc>
           <w:tcPr>
-            <w:tcW w:type="dxa" w:w="1605"/>
+            <w:tcW w:type="dxa" w:w="1376"/>
           </w:tcPr>
           <w:p>
             <w:r>
@@ -1685,7 +2733,7 @@
         </w:tc>
         <w:tc>
           <w:tcPr>
-            <w:tcW w:type="dxa" w:w="1605"/>
+            <w:tcW w:type="dxa" w:w="1376"/>
           </w:tcPr>
           <w:p>
             <w:r>
@@ -1699,7 +2747,27 @@
                 <w:b/>
                 <w:sz w:val="18"/>
               </w:rPr>
-              <w:t>Standardised loadings</w:t>
+              <w:t>Loadings</w:t>
+            </w:r>
+          </w:p>
+        </w:tc>
+        <w:tc>
+          <w:tcPr>
+            <w:tcW w:type="dxa" w:w="1376"/>
+          </w:tcPr>
+          <w:p>
+            <w:r>
+              <w:rPr>
+                <w:b/>
+                <w:sz w:val="18"/>
+              </w:rPr>
+            </w:r>
+            <w:r>
+              <w:rPr>
+                <w:b/>
+                <w:sz w:val="18"/>
+              </w:rPr>
+              <w:t>Highest HTMT</w:t>
             </w:r>
           </w:p>
         </w:tc>
@@ -1707,7 +2775,7 @@
       <w:tr>
         <w:tc>
           <w:tcPr>
-            <w:tcW w:type="dxa" w:w="1605"/>
+            <w:tcW w:type="dxa" w:w="1376"/>
           </w:tcPr>
           <w:p>
             <w:r>
@@ -1727,7 +2795,7 @@
         </w:tc>
         <w:tc>
           <w:tcPr>
-            <w:tcW w:type="dxa" w:w="1605"/>
+            <w:tcW w:type="dxa" w:w="1376"/>
           </w:tcPr>
           <w:p>
             <w:r>
@@ -1747,7 +2815,7 @@
         </w:tc>
         <w:tc>
           <w:tcPr>
-            <w:tcW w:type="dxa" w:w="1605"/>
+            <w:tcW w:type="dxa" w:w="1376"/>
           </w:tcPr>
           <w:p>
             <w:r>
@@ -1767,7 +2835,7 @@
         </w:tc>
         <w:tc>
           <w:tcPr>
-            <w:tcW w:type="dxa" w:w="1605"/>
+            <w:tcW w:type="dxa" w:w="1376"/>
           </w:tcPr>
           <w:p>
             <w:r>
@@ -1787,7 +2855,7 @@
         </w:tc>
         <w:tc>
           <w:tcPr>
-            <w:tcW w:type="dxa" w:w="1605"/>
+            <w:tcW w:type="dxa" w:w="1376"/>
           </w:tcPr>
           <w:p>
             <w:r>
@@ -1807,7 +2875,7 @@
         </w:tc>
         <w:tc>
           <w:tcPr>
-            <w:tcW w:type="dxa" w:w="1605"/>
+            <w:tcW w:type="dxa" w:w="1376"/>
           </w:tcPr>
           <w:p>
             <w:r>
@@ -1825,11 +2893,31 @@
             </w:r>
           </w:p>
         </w:tc>
+        <w:tc>
+          <w:tcPr>
+            <w:tcW w:type="dxa" w:w="1376"/>
+          </w:tcPr>
+          <w:p>
+            <w:r>
+              <w:rPr>
+                <w:b w:val="0"/>
+                <w:sz w:val="18"/>
+              </w:rPr>
+            </w:r>
+            <w:r>
+              <w:rPr>
+                <w:b w:val="0"/>
+                <w:sz w:val="18"/>
+              </w:rPr>
+              <w:t>0.56 (VEG)</w:t>
+            </w:r>
+          </w:p>
+        </w:tc>
       </w:tr>
       <w:tr>
         <w:tc>
           <w:tcPr>
-            <w:tcW w:type="dxa" w:w="1605"/>
+            <w:tcW w:type="dxa" w:w="1376"/>
           </w:tcPr>
           <w:p>
             <w:r>
@@ -1849,7 +2937,7 @@
         </w:tc>
         <w:tc>
           <w:tcPr>
-            <w:tcW w:type="dxa" w:w="1605"/>
+            <w:tcW w:type="dxa" w:w="1376"/>
           </w:tcPr>
           <w:p>
             <w:r>
@@ -1869,7 +2957,7 @@
         </w:tc>
         <w:tc>
           <w:tcPr>
-            <w:tcW w:type="dxa" w:w="1605"/>
+            <w:tcW w:type="dxa" w:w="1376"/>
           </w:tcPr>
           <w:p>
             <w:r>
@@ -1889,7 +2977,7 @@
         </w:tc>
         <w:tc>
           <w:tcPr>
-            <w:tcW w:type="dxa" w:w="1605"/>
+            <w:tcW w:type="dxa" w:w="1376"/>
           </w:tcPr>
           <w:p>
             <w:r>
@@ -1909,7 +2997,7 @@
         </w:tc>
         <w:tc>
           <w:tcPr>
-            <w:tcW w:type="dxa" w:w="1605"/>
+            <w:tcW w:type="dxa" w:w="1376"/>
           </w:tcPr>
           <w:p>
             <w:r>
@@ -1929,7 +3017,7 @@
         </w:tc>
         <w:tc>
           <w:tcPr>
-            <w:tcW w:type="dxa" w:w="1605"/>
+            <w:tcW w:type="dxa" w:w="1376"/>
           </w:tcPr>
           <w:p>
             <w:r>
@@ -1947,11 +3035,31 @@
             </w:r>
           </w:p>
         </w:tc>
+        <w:tc>
+          <w:tcPr>
+            <w:tcW w:type="dxa" w:w="1376"/>
+          </w:tcPr>
+          <w:p>
+            <w:r>
+              <w:rPr>
+                <w:b w:val="0"/>
+                <w:sz w:val="18"/>
+              </w:rPr>
+            </w:r>
+            <w:r>
+              <w:rPr>
+                <w:b w:val="0"/>
+                <w:sz w:val="18"/>
+              </w:rPr>
+              <w:t>0.65 (VEG)</w:t>
+            </w:r>
+          </w:p>
+        </w:tc>
       </w:tr>
       <w:tr>
         <w:tc>
           <w:tcPr>
-            <w:tcW w:type="dxa" w:w="1605"/>
+            <w:tcW w:type="dxa" w:w="1376"/>
           </w:tcPr>
           <w:p>
             <w:r>
@@ -1971,7 +3079,7 @@
         </w:tc>
         <w:tc>
           <w:tcPr>
-            <w:tcW w:type="dxa" w:w="1605"/>
+            <w:tcW w:type="dxa" w:w="1376"/>
           </w:tcPr>
           <w:p>
             <w:r>
@@ -1991,7 +3099,7 @@
         </w:tc>
         <w:tc>
           <w:tcPr>
-            <w:tcW w:type="dxa" w:w="1605"/>
+            <w:tcW w:type="dxa" w:w="1376"/>
           </w:tcPr>
           <w:p>
             <w:r>
@@ -2011,7 +3119,7 @@
         </w:tc>
         <w:tc>
           <w:tcPr>
-            <w:tcW w:type="dxa" w:w="1605"/>
+            <w:tcW w:type="dxa" w:w="1376"/>
           </w:tcPr>
           <w:p>
             <w:r>
@@ -2031,7 +3139,7 @@
         </w:tc>
         <w:tc>
           <w:tcPr>
-            <w:tcW w:type="dxa" w:w="1605"/>
+            <w:tcW w:type="dxa" w:w="1376"/>
           </w:tcPr>
           <w:p>
             <w:r>
@@ -2051,7 +3159,7 @@
         </w:tc>
         <w:tc>
           <w:tcPr>
-            <w:tcW w:type="dxa" w:w="1605"/>
+            <w:tcW w:type="dxa" w:w="1376"/>
           </w:tcPr>
           <w:p>
             <w:r>
@@ -2069,11 +3177,31 @@
             </w:r>
           </w:p>
         </w:tc>
+        <w:tc>
+          <w:tcPr>
+            <w:tcW w:type="dxa" w:w="1376"/>
+          </w:tcPr>
+          <w:p>
+            <w:r>
+              <w:rPr>
+                <w:b w:val="0"/>
+                <w:sz w:val="18"/>
+              </w:rPr>
+            </w:r>
+            <w:r>
+              <w:rPr>
+                <w:b w:val="0"/>
+                <w:sz w:val="18"/>
+              </w:rPr>
+              <w:t>0.74 (SOIL)</w:t>
+            </w:r>
+          </w:p>
+        </w:tc>
       </w:tr>
       <w:tr>
         <w:tc>
           <w:tcPr>
-            <w:tcW w:type="dxa" w:w="1605"/>
+            <w:tcW w:type="dxa" w:w="1376"/>
           </w:tcPr>
           <w:p>
             <w:r>
@@ -2093,7 +3221,7 @@
         </w:tc>
         <w:tc>
           <w:tcPr>
-            <w:tcW w:type="dxa" w:w="1605"/>
+            <w:tcW w:type="dxa" w:w="1376"/>
           </w:tcPr>
           <w:p>
             <w:r>
@@ -2113,7 +3241,7 @@
         </w:tc>
         <w:tc>
           <w:tcPr>
-            <w:tcW w:type="dxa" w:w="1605"/>
+            <w:tcW w:type="dxa" w:w="1376"/>
           </w:tcPr>
           <w:p>
             <w:r>
@@ -2133,7 +3261,7 @@
         </w:tc>
         <w:tc>
           <w:tcPr>
-            <w:tcW w:type="dxa" w:w="1605"/>
+            <w:tcW w:type="dxa" w:w="1376"/>
           </w:tcPr>
           <w:p>
             <w:r>
@@ -2153,7 +3281,7 @@
         </w:tc>
         <w:tc>
           <w:tcPr>
-            <w:tcW w:type="dxa" w:w="1605"/>
+            <w:tcW w:type="dxa" w:w="1376"/>
           </w:tcPr>
           <w:p>
             <w:r>
@@ -2173,7 +3301,7 @@
         </w:tc>
         <w:tc>
           <w:tcPr>
-            <w:tcW w:type="dxa" w:w="1605"/>
+            <w:tcW w:type="dxa" w:w="1376"/>
           </w:tcPr>
           <w:p>
             <w:r>
@@ -2191,11 +3319,31 @@
             </w:r>
           </w:p>
         </w:tc>
+        <w:tc>
+          <w:tcPr>
+            <w:tcW w:type="dxa" w:w="1376"/>
+          </w:tcPr>
+          <w:p>
+            <w:r>
+              <w:rPr>
+                <w:b w:val="0"/>
+                <w:sz w:val="18"/>
+              </w:rPr>
+            </w:r>
+            <w:r>
+              <w:rPr>
+                <w:b w:val="0"/>
+                <w:sz w:val="18"/>
+              </w:rPr>
+              <w:t>0.74 (VEG)</w:t>
+            </w:r>
+          </w:p>
+        </w:tc>
       </w:tr>
       <w:tr>
         <w:tc>
           <w:tcPr>
-            <w:tcW w:type="dxa" w:w="1605"/>
+            <w:tcW w:type="dxa" w:w="1376"/>
           </w:tcPr>
           <w:p>
             <w:r>
@@ -2215,7 +3363,7 @@
         </w:tc>
         <w:tc>
           <w:tcPr>
-            <w:tcW w:type="dxa" w:w="1605"/>
+            <w:tcW w:type="dxa" w:w="1376"/>
           </w:tcPr>
           <w:p>
             <w:r>
@@ -2235,7 +3383,7 @@
         </w:tc>
         <w:tc>
           <w:tcPr>
-            <w:tcW w:type="dxa" w:w="1605"/>
+            <w:tcW w:type="dxa" w:w="1376"/>
           </w:tcPr>
           <w:p>
             <w:r>
@@ -2255,7 +3403,7 @@
         </w:tc>
         <w:tc>
           <w:tcPr>
-            <w:tcW w:type="dxa" w:w="1605"/>
+            <w:tcW w:type="dxa" w:w="1376"/>
           </w:tcPr>
           <w:p>
             <w:r>
@@ -2275,7 +3423,7 @@
         </w:tc>
         <w:tc>
           <w:tcPr>
-            <w:tcW w:type="dxa" w:w="1605"/>
+            <w:tcW w:type="dxa" w:w="1376"/>
           </w:tcPr>
           <w:p>
             <w:r>
@@ -2295,7 +3443,7 @@
         </w:tc>
         <w:tc>
           <w:tcPr>
-            <w:tcW w:type="dxa" w:w="1605"/>
+            <w:tcW w:type="dxa" w:w="1376"/>
           </w:tcPr>
           <w:p>
             <w:r>
@@ -2313,6 +3461,26 @@
             </w:r>
           </w:p>
         </w:tc>
+        <w:tc>
+          <w:tcPr>
+            <w:tcW w:type="dxa" w:w="1376"/>
+          </w:tcPr>
+          <w:p>
+            <w:r>
+              <w:rPr>
+                <w:b w:val="0"/>
+                <w:sz w:val="18"/>
+              </w:rPr>
+            </w:r>
+            <w:r>
+              <w:rPr>
+                <w:b w:val="0"/>
+                <w:sz w:val="18"/>
+              </w:rPr>
+              <w:t>0.66 (VEG)</w:t>
+            </w:r>
+          </w:p>
+        </w:tc>
       </w:tr>
     </w:tbl>
     <w:p/>
@@ -2321,21 +3489,12 @@
         <w:pStyle w:val="Heading2"/>
       </w:pPr>
       <w:r>
-        <w:t>3.4 Overall perception profile (RQ2)</w:t>
+        <w:t>3.4 Overall profile (RQ2)</w:t>
       </w:r>
     </w:p>
     <w:p>
       <w:r>
-        <w:t xml:space="preserve">Environmental perception had the highest mean index (73.0, 95% CI 71.2–74.9), followed by vegetation and climate awareness (68.9, 66.8–71.0), usage and access (67.4, 65.2–69.7) and soil and ecological function (65.7, 63.6–67.8). Governance and management scored lowest (60.3, 58.1–62.6). The overall GSPI was 67.1 (65.5–68.7) (Fig. 1). The paired differences were consistent: environmental perception exceeded governance by 12.7 points (Wilcoxon </w:t>
-      </w:r>
-      <w:r>
-        <w:rPr>
-          <w:i/>
-        </w:rPr>
-        <w:t>p</w:t>
-      </w:r>
-      <w:r>
-        <w:t xml:space="preserve"> &lt; 0.001) and soil and ecological function exceeded governance by 5.3 points (</w:t>
+        <w:t xml:space="preserve">Environmental perception scored highest (73.0, 95% CI 71.2–74.9). Vegetation and climate awareness came next (68.9, 66.8–71.0), then usage and access (67.4, 65.2–69.7) and soil and ecological function (65.7, 63.6–67.8). Governance came last (60.3, 58.1–62.6). The GSPI was 67.1 (65.5–68.7) (Fig. 1). The paired contrasts agreed: environmental perception beat governance by 12.7 points, and soil/ecological function beat it by 5.3 points (both Wilcoxon </w:t>
       </w:r>
       <w:r>
         <w:rPr>
@@ -2406,12 +3565,12 @@
         <w:pStyle w:val="Heading2"/>
       </w:pPr>
       <w:r>
-        <w:t>3.5 Differences by class and respondent characteristics (RQ3)</w:t>
+        <w:t>3.5 Differences by class and respondent (RQ3)</w:t>
       </w:r>
     </w:p>
     <w:p>
       <w:r>
-        <w:t>Of the 36 tests in the confirmatory family, seven were nominally significant (</w:t>
+        <w:t xml:space="preserve">Seven of the 36 tests reached </w:t>
       </w:r>
       <w:r>
         <w:rPr>
@@ -2420,7 +3579,7 @@
         <w:t>p</w:t>
       </w:r>
       <w:r>
-        <w:t xml:space="preserve"> &lt; 0.05) and two remained significant after Holm correction (Fig. 4; Supplementary Table S4).</w:t>
+        <w:t xml:space="preserve"> &lt; 0.05. Two survived Holm correction (Fig. 4; Supplementary Table S4).</w:t>
       </w:r>
     </w:p>
     <w:p>
@@ -2428,10 +3587,10 @@
         <w:rPr>
           <w:b/>
         </w:rPr>
-        <w:t>Green-space class and usage and access.</w:t>
-      </w:r>
-      <w:r>
-        <w:t xml:space="preserve"> Class differed strongly in usage and access (H(6) = 28.6, </w:t>
+        <w:t>Class and access.</w:t>
+      </w:r>
+      <w:r>
+        <w:t xml:space="preserve"> Class had a clear effect on usage and access (H(6) = 28.6, </w:t>
       </w:r>
       <w:r>
         <w:rPr>
@@ -2449,7 +3608,7 @@
         <w:t>p</w:t>
       </w:r>
       <w:r>
-        <w:t xml:space="preserve"> = 0.003, ε² = 0.077). Urban forest scored lowest (53.2) and grassland/scrub next (55.8), against 70.2 for managed parks, 72.6 for neighbourhood parks and 71.5 for avenues (Fig. 2). After Holm correction, urban forest was rated less accessible than managed parks, lake-riparian systems, neighbourhood parks and avenues (rank-biserial </w:t>
+        <w:t xml:space="preserve"> = 0.003, ε² = 0.077). Urban forest scored lowest (53.2), with grassland/scrub close behind (55.8). Managed parks scored 70.2, avenues 71.5 and neighbourhood parks 72.6 (Fig. 2). Pairwise tests, corrected, placed urban forest below managed parks, lake-riparian systems, neighbourhood parks and avenues (rank-biserial </w:t>
       </w:r>
       <w:r>
         <w:rPr>
@@ -2458,7 +3617,7 @@
         <w:t>r</w:t>
       </w:r>
       <w:r>
-        <w:t xml:space="preserve"> between −0.43 and −0.54), and grassland/scrub less accessible than neighbourhood parks (</w:t>
+        <w:t xml:space="preserve"> from −0.43 to −0.54), and grassland/scrub below neighbourhood parks (</w:t>
       </w:r>
       <w:r>
         <w:rPr>
@@ -2467,7 +3626,7 @@
         <w:t>r</w:t>
       </w:r>
       <w:r>
-        <w:t xml:space="preserve"> = −0.48). The class effect on environmental perception was nominally significant (H(6) = 15.9, </w:t>
+        <w:t xml:space="preserve"> = −0.48). Class also seemed to affect environmental perception (H(6) = 15.9, </w:t>
       </w:r>
       <w:r>
         <w:rPr>
@@ -2476,7 +3635,7 @@
         <w:t>p</w:t>
       </w:r>
       <w:r>
-        <w:t xml:space="preserve"> = 0.014) but did not survive correction (Holm </w:t>
+        <w:t xml:space="preserve"> = 0.014), but that effect didn't survive correction (Holm </w:t>
       </w:r>
       <w:r>
         <w:rPr>
@@ -2539,7 +3698,7 @@
         <w:rPr>
           <w:sz w:val="19"/>
         </w:rPr>
-        <w:t xml:space="preserve"> Mean perception index (0–100) for each dimension by green-space class. USE, usage and access; ENV, environmental perception; VEG, vegetation and climate awareness; SOIL, soil and ecological function; GOV, governance and management.</w:t>
+        <w:t xml:space="preserve"> Mean index (0–100) for each dimension by green-space class. USE, usage and access; ENV, environmental perception; VEG, vegetation and climate awareness; SOIL, soil and ecological function; GOV, governance and management.</w:t>
       </w:r>
     </w:p>
     <w:p>
@@ -2547,10 +3706,10 @@
         <w:rPr>
           <w:b/>
         </w:rPr>
-        <w:t>Length of residence and governance.</w:t>
-      </w:r>
-      <w:r>
-        <w:t xml:space="preserve"> Governance ratings rose with length of residence (H(3) = 17.8, </w:t>
+        <w:t>Residence and governance.</w:t>
+      </w:r>
+      <w:r>
+        <w:t xml:space="preserve"> Governance ratings rose with time spent in the city (H(3) = 17.8, </w:t>
       </w:r>
       <w:r>
         <w:rPr>
@@ -2568,7 +3727,7 @@
         <w:t>p</w:t>
       </w:r>
       <w:r>
-        <w:t xml:space="preserve"> = 0.017, ε² = 0.050; Fig. 5). Residents of more than ten years rated governance higher (64.8) than those of 1–5 years (52.3; </w:t>
+        <w:t xml:space="preserve"> = 0.017, ε² = 0.050; Fig. 3). People resident for over ten years gave governance 64.8. Those resident 1–5 years gave 52.3 (</w:t>
       </w:r>
       <w:r>
         <w:rPr>
@@ -2577,7 +3736,7 @@
         <w:t>r</w:t>
       </w:r>
       <w:r>
-        <w:t xml:space="preserve"> = −0.34) and 6–10 years (56.2; </w:t>
+        <w:t xml:space="preserve"> = −0.34) and those resident 6–10 years gave 56.2 (</w:t>
       </w:r>
       <w:r>
         <w:rPr>
@@ -2586,7 +3745,7 @@
         <w:t>r</w:t>
       </w:r>
       <w:r>
-        <w:t xml:space="preserve"> = −0.25), after Holm correction. The difference between the shortest residents (&lt;1 year, n = 15, 58.1) and others could not be resolved because that group is small. Residence also showed nominal effects on vegetation awareness, soil/ecological function and the GSPI that did not survive correction.</w:t>
+        <w:t xml:space="preserve"> = −0.25), both differences significant after correction. Newcomers of under a year (n = 15, 58.1) were too few to separate from the rest. Residence also showed nominal effects on vegetation awareness, soil/ecological function and the GSPI, none of which survived.</w:t>
       </w:r>
     </w:p>
     <w:p>
@@ -2640,7 +3799,7 @@
         <w:rPr>
           <w:sz w:val="19"/>
         </w:rPr>
-        <w:t xml:space="preserve"> Governance index by length of residence (mean with 95% bootstrap CI); dashed line is the overall mean.</w:t>
+        <w:t xml:space="preserve"> Governance index by length of residence (mean with 95% bootstrap CI). The dashed line is the overall mean.</w:t>
       </w:r>
     </w:p>
     <w:p>
@@ -2651,7 +3810,7 @@
         <w:t>Other characteristics.</w:t>
       </w:r>
       <w:r>
-        <w:t xml:space="preserve"> Education had one nominal effect, on vegetation awareness (H(3) = 10.2, </w:t>
+        <w:t xml:space="preserve"> Education produced one nominal effect, on vegetation awareness (H(3) = 10.2, </w:t>
       </w:r>
       <w:r>
         <w:rPr>
@@ -2669,7 +3828,7 @@
         <w:t>p</w:t>
       </w:r>
       <w:r>
-        <w:t xml:space="preserve"> = 0.52). Age, gender and occupation showed no effects at the uncorrected level on any dimension (Fig. 4). In the GSPI regression, the model explained little variance (R² = 0.101, adjusted R² = 0.034); one coefficient (avenue plantations, β = 0.43, </w:t>
+        <w:t xml:space="preserve"> = 0.52). Age, gender and occupation produced none, even before correction. The GSPI regression explained little (R² = 0.101, adjusted R² = 0.034). Only one coefficient, for avenues, was nominally significant (β = 0.43, </w:t>
       </w:r>
       <w:r>
         <w:rPr>
@@ -2678,7 +3837,7 @@
         <w:t>p</w:t>
       </w:r>
       <w:r>
-        <w:t xml:space="preserve"> = 0.008) was nominally significant and none survived Holm correction.</w:t>
+        <w:t xml:space="preserve"> = 0.008), and it didn't survive Holm correction.</w:t>
       </w:r>
     </w:p>
     <w:p>
@@ -2732,7 +3891,7 @@
         <w:rPr>
           <w:sz w:val="19"/>
         </w:rPr>
-        <w:t xml:space="preserve"> Effect sizes (ε²) for the 30 tests on the five dimension indexes, by grouping variable. Blue circles survived Holm correction across all 36 tests; orange diamonds were nominally significant only.</w:t>
+        <w:t xml:space="preserve"> Effect sizes (ε²) for the 30 tests on the five dimension indexes. Blue circles survived Holm correction across all 36 tests; orange diamonds were nominally significant only.</w:t>
       </w:r>
     </w:p>
     <w:p>
@@ -2740,12 +3899,12 @@
         <w:pStyle w:val="Heading2"/>
       </w:pPr>
       <w:r>
-        <w:t>3.6 Appreciation versus ecological-function endorsement (RQ4)</w:t>
+        <w:t>3.6 The salience gap (RQ4)</w:t>
       </w:r>
     </w:p>
     <w:p>
       <w:r>
-        <w:t xml:space="preserve">Residents rated the visible environmental benefits of green space higher than its ecological functions. The mean gap was 7.3 points (95% CI 5.4–9.3; Wilcoxon </w:t>
+        <w:t xml:space="preserve">Residents rated the benefits they feel above the functions they can't easily see. The mean gap was 7.3 points (95% CI 5.4–9.3; Wilcoxon </w:t>
       </w:r>
       <w:r>
         <w:rPr>
@@ -2763,7 +3922,12 @@
         <w:t>d</w:t>
       </w:r>
       <w:r>
-        <w:t xml:space="preserve">z = 0.42); 62.7% of respondents scored environmental perception above soil/ecological function, 9.7% scored them equally and 27.6% scored them lower. The gap was positive in all seven classes (Fig. 5; Supplementary Table S5). It ranged from 4.5 points in managed parks to 11.5 in urban forest, and the 95% confidence interval excluded zero in six of seven classes (institutional greens, n = 24: 7.1, CI −0.3 to 14.8). The gap did not differ significantly among classes (H(6) = 6.20, </w:t>
+        <w:t>z = 0.42). For 62.7% of respondents environmental perception was the higher score, for 9.7% the two were equal, and for 27.6% it was lower.</w:t>
+      </w:r>
+    </w:p>
+    <w:p>
+      <w:r>
+        <w:t xml:space="preserve">The gap appeared in all seven classes (Fig. 5; Supplementary Table S5). It ranged from 4.5 points in managed parks to 11.5 in urban forest, and its interval excluded zero everywhere except institutional greens (n = 24; 7.1, CI −0.3 to 14.8). It did not, however, differ significantly between classes (H(6) = 6.20, </w:t>
       </w:r>
       <w:r>
         <w:rPr>
@@ -2772,7 +3936,7 @@
         <w:t>p</w:t>
       </w:r>
       <w:r>
-        <w:t xml:space="preserve"> = 0.40). A post hoc grouping of the two least accessible classes, urban forest and grassland/scrub (n = 48, gap 11.0), against the rest (n = 252, gap 6.6) was not significant (</w:t>
+        <w:t xml:space="preserve"> = 0.40). An exploratory comparison of the two least-reached classes against the rest — urban forest and grassland/scrub (n = 48, gap 11.0) versus the other five (n = 252, gap 6.6) — was also non-significant (</w:t>
       </w:r>
       <w:r>
         <w:rPr>
@@ -2781,7 +3945,7 @@
         <w:t>p</w:t>
       </w:r>
       <w:r>
-        <w:t xml:space="preserve"> = 0.12). We therefore report the larger gaps in urban forest, grassland/scrub and lake-riparian systems as descriptive tendencies and we do not claim that the gap is class-specific.</w:t>
+        <w:t xml:space="preserve"> = 0.12). The larger gaps in forest, scrub and lake-riparian classes may be real, but this sample can't show it.</w:t>
       </w:r>
     </w:p>
     <w:p>
@@ -2835,7 +3999,7 @@
         <w:rPr>
           <w:sz w:val="19"/>
         </w:rPr>
-        <w:t xml:space="preserve"> Gap between environmental perception and soil/ecological function endorsement (index points) by class, with 95% bootstrap CIs. Dashed line, overall mean; solid grey line, zero.</w:t>
+        <w:t xml:space="preserve"> Salience gap (environmental perception minus soil/ecological function, index points) by class, with 95% bootstrap CIs. Dashed line, overall mean; grey line, zero.</w:t>
       </w:r>
     </w:p>
     <w:p>
@@ -2846,7 +4010,7 @@
         <w:t>Sensitivity.</w:t>
       </w:r>
       <w:r>
-        <w:t xml:space="preserve"> Items Q31, Q34 and Q35 are not evaluations of current management. A "core" governance index from Q30, Q32 and Q33 alone (α = 0.72) gave the same residence effect (H(3) = 17.6, </w:t>
+        <w:t xml:space="preserve"> We rebuilt the governance index from the three items that rate current management (Q30, Q32, Q33; α = 0.72). The residence effect stayed the same (H(3) = 17.6, </w:t>
       </w:r>
       <w:r>
         <w:rPr>
@@ -2855,7 +4019,7 @@
         <w:t>p</w:t>
       </w:r>
       <w:r>
-        <w:t xml:space="preserve"> = 0.0005, ε² = 0.049), so the residence–governance finding does not depend on those items.</w:t>
+        <w:t xml:space="preserve"> = 0.0005, ε² = 0.049), so it doesn't rest on the threat and support items.</w:t>
       </w:r>
     </w:p>
     <w:p>
@@ -2871,22 +4035,22 @@
         <w:pStyle w:val="Heading2"/>
       </w:pPr>
       <w:r>
-        <w:t>4.1 What residents value, and what they do not</w:t>
+        <w:t>4.1 Felt benefits lead, management trails</w:t>
       </w:r>
     </w:p>
     <w:p>
       <w:r>
-        <w:t>Residents in this sample rated the felt environmental benefits of green space highest and its management lowest. This ordering is what restoration theory would predict, because cooling, shade and air quality are experienced directly, whereas governance is largely invisible until it fails (Kaplan, 1995; Ulrich et al., 1991). It also matches reports from other cities that residents readily recognise microclimate and amenity benefits but give less weight to wider ecological functions (Jim and Chen, 2006).</w:t>
+        <w:t>Residents in this sample rated cooling, shade and cleaner air highest and management lowest. That ordering makes sense. Environmental benefits are felt on the skin and in the lungs, which is what restoration and stress-recovery accounts would lead us to expect (Kaplan, 1995; Ulrich et al., 1991). Management, by contrast, stays out of sight until something breaks. The ranking also matches Guangzhou, where residents stressed microclimate and environmental quality and paid little attention to habitat and species conservation (Jim and Chen, 2006). Bengaluru's own physical data back the residents up: the city's parks and street trees do cool the air and trap pollutants (Shah et al., 2021; Vailshery et al., 2013).</w:t>
       </w:r>
     </w:p>
     <w:p>
       <w:r>
-        <w:t>The gap between environmental appreciation and ecological-function endorsement (7.3 points, a small-to-moderate effect) supports the working expectation that appreciation exceeds ecological awareness. Two points limit how far we can push this. The two dimensions contain different items, so the gap shows relative endorsement; it is not evidence that residents lack ecological knowledge, which the instrument does not test. And the gap is modest: respondents still endorsed soil and ecological functions well above the scale midpoint (65.7). The more useful reading is that ecological functions, though endorsed, are less salient than the benefits people feel.</w:t>
+        <w:t>The salience gap fits our working expectation, but it needs a careful reading. Soil and ecological functions were still endorsed well above the scale midpoint (65.7). Respondents didn't reject them; they simply endorsed them less firmly than the benefits they feel. Since the instrument measures endorsement and not knowledge, the gap tells us what is salient to residents, not what they know. Calling it an "awareness deficit" would overstate the evidence. Fuller et al. (2007) found that park users perceived species richness accurately for some groups of organisms and poorly for others. That suggests salience depends on what is visible, which is consistent with what we found.</w:t>
       </w:r>
     </w:p>
     <w:p>
       <w:r>
-        <w:t>The gap was positive in every class and we found no evidence that it differs among them. We expected larger gaps in the classes that store most carbon, and the point estimates lean that way (urban forest 11.5, lake-riparian 9.5, grassland/scrub 10.2), but the pattern is not statistically supported and the small classes carry wide intervals. We report it as a hypothesis for a larger sample.</w:t>
+        <w:t>We had expected the gap to be widest in the classes that hold most carbon. The point estimates lean that way (urban forest 11.5, grassland/scrub 10.2, lake-riparian 9.5), but the between-class test was flat. With only 18 to 42 respondents in those classes, we treat the pattern as a hypothesis for a larger survey.</w:t>
       </w:r>
     </w:p>
     <w:p>
@@ -2894,17 +4058,17 @@
         <w:pStyle w:val="Heading2"/>
       </w:pPr>
       <w:r>
-        <w:t>4.2 Access, not appreciation, separates the classes</w:t>
+        <w:t>4.2 Access separates the classes</w:t>
       </w:r>
     </w:p>
     <w:p>
       <w:r>
-        <w:t>The only strong class effect was on usage and access. Urban forest and grassland/scrub were the classes least reached, while neighbourhood parks, managed parks and avenues were the most reached. Appreciation of environmental benefit was high in all classes, including those rated least accessible, so low access did not coincide with low regard. It suggests that closing access gaps to forest and scrub, not persuading residents of their value, is the planning task. Because the classes come from an independent land-cover typology, the result also speaks to the perception–objective congruence question that Reyes-Riveros et al. (2021) identify as open. The nominal differences in environmental perception between classes (highest for avenues, 79.7, and lowest for neighbourhood parks, 67.9) did not survive correction and should not be over-read.</w:t>
+        <w:t>Only one class effect held up: access. Urban forest and grassland/scrub were reached least. Neighbourhood parks, managed parks and avenues were reached most. Yet environmental appreciation stayed high everywhere, including in the hard-to-reach classes. Low access, in other words, didn't mean low regard. Studies in Europe find the same link between distance and use (Schipperijn et al., 2010), and reviews show that access is distributed unevenly, often along income and ethnic lines (Rigolon, 2016; Kabisch and Haase, 2014). For Bengaluru's forest and scrub, the planning task looks like opening the door, not making the case.</w:t>
       </w:r>
     </w:p>
     <w:p>
       <w:r>
-        <w:t>The class effect also shows why a typology matters. A single "green space" question would have averaged over a 20-point spread in access.</w:t>
+        <w:t>The typology earned its place here. A single "green space" question would have averaged over a 19-point spread in access, from 53.2 to 72.6. Because the classes come from an independent land-cover map, the result also speaks to the call by Reyes-Riveros et al. (2021) to set perception against objective measures. The class differences in environmental perception (highest for avenues at 79.7, lowest for neighbourhood parks at 67.9) didn't survive correction, and we don't build on them.</w:t>
       </w:r>
     </w:p>
     <w:p>
@@ -2912,17 +4076,17 @@
         <w:pStyle w:val="Heading2"/>
       </w:pPr>
       <w:r>
-        <w:t>4.3 Governance is the weakest link, and long-term residents are kinder</w:t>
+        <w:t>4.3 Governance, maintenance and tenure</w:t>
       </w:r>
     </w:p>
     <w:p>
       <w:r>
-        <w:t>Governance was the lowest-rated dimension in five of the seven classes (in urban forest and grassland/scrub, usage and access was lower), and no class reached 70 on it. This is a fixable problem relative to most others in the study: perceived management quality depends on maintenance, signage, lighting, safety and visible upkeep, which a city can improve within a budget cycle. Wolch et al. (2014) caution that improving green space without attention to who benefits can displace the people it is meant to serve, so maintenance should be paired with access measures.</w:t>
+        <w:t>Governance was the weakest dimension in five of seven classes (in urban forest and grassland/scrub, access was lower still), and no class reached 70 on it. Among the five dimensions, governance is probably the easiest to change. Poorly kept vegetation is the park feature most often tied to fear of crime (Sreetheran and van den Bosch, 2014). Perceived quality, not just presence, predicts satisfaction and quality of life among park visitors (Kothencz et al., 2017). Visible maintenance can change within a budget cycle. Improvements still need care: greening that ignores who benefits can push out the residents it was meant to serve (Wolch et al., 2014).</w:t>
       </w:r>
     </w:p>
     <w:p>
       <w:r>
-        <w:t>Longer residence was associated with higher governance ratings, contrary to the idea that long exposure breeds disillusion. Several explanations are possible: long-term residents may know whom to approach, may have seen improvements, or may be more attached to a place they know; newcomers may compare Bengaluru with cities they left. This cross-sectional design cannot tell these apart, and the shortest-tenure group is small (n = 15). We also note that the effect is of moderate size (ε² = 0.050) and that other dimensions' residence effects did not survive correction. The result echoes Thapa et al.'s (2024) finding in Bengaluru that wellbeing varied with social factors, but our evidence is limited to governance.</w:t>
+        <w:t>Long-term residents rated governance higher than people who had arrived in the last decade. We didn't expect that. Several readings fit. Long-term residents may know whom to approach. They may have watched conditions improve, or feel attached to places they know well. Recent arrivals may be comparing Bengaluru with the cities they left. The design can't separate these, and the newest group is small (n = 15). The effect is moderate (ε² = 0.050), and residence effects on other dimensions vanished after correction. The finding chimes with evidence from Bengaluru that well-being differs across social groups (Thapa et al., 2024), but our evidence covers governance alone.</w:t>
       </w:r>
     </w:p>
     <w:p>
@@ -2930,12 +4094,12 @@
         <w:pStyle w:val="Heading2"/>
       </w:pPr>
       <w:r>
-        <w:t>4.4 Limited demographic variation</w:t>
+        <w:t>4.4 Little demographic variation</w:t>
       </w:r>
     </w:p>
     <w:p>
       <w:r>
-        <w:t>Age, gender and occupation showed no detectable effect on any dimension, and education and residence had at most nominal effects on awareness. Quotas equalised group sizes, which helps comparisons, but the sample was not designed to represent income, ward or neighbourhood, which the instrument did not record. Studies elsewhere have found that socio-demographic groups differ in how they perceive and use green space (Lo and Jim, 2010), so the absence of demographic differences here should not be read as proof of equality in the wider city.</w:t>
+        <w:t>Age, gender and occupation made no detectable difference to any dimension. Education and residence produced only nominal effects on awareness. Plieninger et al. (2022) likewise found small socio-demographic differences in how Bengaluru residents value lakes, so the pattern may be local. Elsewhere, though, perceptions and use do split along social lines (Jim and Shan, 2013; Lo and Jim, 2010). Our quotas balanced groups but didn't record income, ward or distance, which is exactly where inequity tends to appear (Rigolon, 2016). The null result here is not evidence that Bengaluru's green space is equally shared.</w:t>
       </w:r>
     </w:p>
     <w:p>
@@ -2943,12 +4107,12 @@
         <w:pStyle w:val="Heading2"/>
       </w:pPr>
       <w:r>
-        <w:t>4.5 Methodological contribution</w:t>
+        <w:t>4.5 What the instrument offers, and what it doesn't</w:t>
       </w:r>
     </w:p>
     <w:p>
       <w:r>
-        <w:t>The five-dimension structure held up under CFA and EFA, with reliabilities of 0.80–0.86 and a clearly better fit than a single factor. Three caveats follow from the results. Parallel analysis favoured four factors, so the separation of the fifth is supported by the CFA comparison and by the designed item content more than by an eigenvalue test. AVE was modest and discriminant validity was partial, in particular between vegetation/climate awareness and soil/ecological function. And the CFA fit was very close (RMSEA 0.019), which deserves replication on an independent sample before others adopt the model. We therefore present the instrument as a reliable, structured profile and not as a validated scale.</w:t>
+        <w:t>The instrument holds five distinct dimensions that load on one general factor. The evidence for that comes from nested CFA, the HTMT criterion, the second-order model and reliabilities of 0.80–0.86, which goes further than most perception surveys report. Three cautions remain. Parallel analysis favoured four components, so the case for five rests on the confirmatory tests and on item content. AVE was modest. And the fit of the five-factor model was very close (RMSEA 0.019), which other samples should test before anyone treats the model as settled. We offer it as a structured, reliable profile tied to a mapped typology, ready for replication.</w:t>
       </w:r>
     </w:p>
     <w:p>
@@ -2956,12 +4120,12 @@
         <w:pStyle w:val="Heading2"/>
       </w:pPr>
       <w:r>
-        <w:t>4.6 Implications for planning and management</w:t>
+        <w:t>4.6 Implications for management</w:t>
       </w:r>
     </w:p>
     <w:p>
       <w:r>
-        <w:t>The findings suggest three actions, ordered by how directly the data support them.</w:t>
+        <w:t>The findings support three actions, listed from the most to the least directly supported.</w:t>
       </w:r>
     </w:p>
     <w:p>
@@ -2975,7 +4139,7 @@
         <w:t>Make management visible.</w:t>
       </w:r>
       <w:r>
-        <w:t xml:space="preserve"> Because governance ratings were lowest, visible upkeep (clean and lit paths, posted maintenance schedules, a named managing authority) is the quickest way to raise the experience of green space. Awareness of the managing authority (Q32) is itself a governance item.</w:t>
+        <w:t xml:space="preserve"> Governance scored lowest, so clean and lit paths, posted maintenance schedules and a clearly named managing authority are the fastest way to improve how residents experience green space. Awareness of who manages a space (Q32) is itself part of the governance score.</w:t>
       </w:r>
     </w:p>
     <w:p>
@@ -2986,10 +4150,10 @@
         <w:rPr>
           <w:b/>
         </w:rPr>
-        <w:t>Close access gaps to forest and scrub.</w:t>
-      </w:r>
-      <w:r>
-        <w:t xml:space="preserve"> Urban forest and grassland/scrub were the least accessible classes. Entry points, transport links and interpretation at these sites would convert existing regard into use, while access controls should respect their ecological sensitivity.</w:t>
+        <w:t>Open up forest and scrub.</w:t>
+      </w:r>
+      <w:r>
+        <w:t xml:space="preserve"> These classes were the least reached but still highly regarded. Better entry points, transport links and trail information would turn that regard into visits, with access managed to protect sensitive habitat.</w:t>
       </w:r>
     </w:p>
     <w:p>
@@ -3000,10 +4164,10 @@
         <w:rPr>
           <w:b/>
         </w:rPr>
-        <w:t>Make ecological functions visible.</w:t>
-      </w:r>
-      <w:r>
-        <w:t xml:space="preserve"> Interpretation about soil, water absorption and biodiversity at heavily used parks would address the modest under-endorsement of ecological functions where residents already go.</w:t>
+        <w:t>Show the hidden functions.</w:t>
+      </w:r>
+      <w:r>
+        <w:t xml:space="preserve"> Signs and short guides on soil, rainwater absorption and biodiversity in the most-used parks would address the salience gap where residents already go.</w:t>
       </w:r>
     </w:p>
     <w:p>
@@ -3016,7 +4180,91 @@
     </w:p>
     <w:p>
       <w:r>
-        <w:t>Five limitations qualify these findings. (i) The sample is a quota-balanced purposive sample of 300 collected by one researcher and is not representative of Bengaluru, so levels (for example, percentage agreement) describe the sample and cannot be generalised. (ii) Respondents chose their own class, so class sizes are unequal (6% to 28%) and the small classes (grassland/scrub, n = 18; institutional and avenue, n = 24 each) have wide uncertainty; class differences also reflect who uses each class, not only the class itself. (iii) Perception is self-reported and cross-sectional, so we cannot infer causation or change over time, and acquiescence and social-desirability bias may inflate agreement with virtuous statements. (iv) The "awareness" dimensions are self-rated endorsements; they are not knowledge tests, and the environmental and ecological dimensions contain different items. (v) The governance dimension mixes evaluations of current management with threat awareness and support for conservation, although a sensitivity analysis showed that the residence effect did not depend on those items. The instrument was also not designed to capture income, ward or distance to the green space, which prevents tests of environmental-justice questions.</w:t>
+        <w:t>Several limits apply.</w:t>
+      </w:r>
+    </w:p>
+    <w:p>
+      <w:pPr>
+        <w:pStyle w:val="ListNumber"/>
+      </w:pPr>
+      <w:r>
+        <w:rPr>
+          <w:b/>
+        </w:rPr>
+        <w:t>Sample.</w:t>
+      </w:r>
+      <w:r>
+        <w:t xml:space="preserve"> The sample is a purposive quota sample of 300, collected by one researcher, and isn't representative of Bengaluru. Levels such as percentage agreement can't be generalised.</w:t>
+      </w:r>
+    </w:p>
+    <w:p>
+      <w:pPr>
+        <w:pStyle w:val="ListNumber"/>
+      </w:pPr>
+      <w:r>
+        <w:rPr>
+          <w:b/>
+        </w:rPr>
+        <w:t>Class sizes.</w:t>
+      </w:r>
+      <w:r>
+        <w:t xml:space="preserve"> Class was self-selected. Sizes are uneven (6–28%), and the small classes (grassland/scrub, n = 18; institutional and avenue, n = 24 each) carry wide uncertainty. Class differences also mix the effect of the place with the profile of the people who use it.</w:t>
+      </w:r>
+    </w:p>
+    <w:p>
+      <w:pPr>
+        <w:pStyle w:val="ListNumber"/>
+      </w:pPr>
+      <w:r>
+        <w:rPr>
+          <w:b/>
+        </w:rPr>
+        <w:t>Design.</w:t>
+      </w:r>
+      <w:r>
+        <w:t xml:space="preserve"> Responses are self-reported and cross-sectional. Causal claims aren't possible, and acquiescence or social desirability may inflate agreement with virtuous statements.</w:t>
+      </w:r>
+    </w:p>
+    <w:p>
+      <w:pPr>
+        <w:pStyle w:val="ListNumber"/>
+      </w:pPr>
+      <w:r>
+        <w:rPr>
+          <w:b/>
+        </w:rPr>
+        <w:t>Measurement.</w:t>
+      </w:r>
+      <w:r>
+        <w:t xml:space="preserve"> The "awareness" dimensions measure endorsement, not knowledge, and the environmental and ecological scales use different items. Maximum-likelihood CFA treats five-point items as continuous; the near-symmetric distributions make this reasonable, but estimators for ordinal data would be a useful check. We could not test measurement invariance across groups because several cells were too small for multi-group models.</w:t>
+      </w:r>
+    </w:p>
+    <w:p>
+      <w:pPr>
+        <w:pStyle w:val="ListNumber"/>
+      </w:pPr>
+      <w:r>
+        <w:rPr>
+          <w:b/>
+        </w:rPr>
+        <w:t>Governance scale.</w:t>
+      </w:r>
+      <w:r>
+        <w:t xml:space="preserve"> Governance mixes ratings of current management with threat perception and support, though the residence finding held when those items were dropped.</w:t>
+      </w:r>
+    </w:p>
+    <w:p>
+      <w:pPr>
+        <w:pStyle w:val="ListNumber"/>
+      </w:pPr>
+      <w:r>
+        <w:rPr>
+          <w:b/>
+        </w:rPr>
+        <w:t>Missing variables.</w:t>
+      </w:r>
+      <w:r>
+        <w:t xml:space="preserve"> The instrument didn't record income, ward or travel distance, so questions of environmental justice remain open.</w:t>
       </w:r>
     </w:p>
     <w:p>
@@ -3029,7 +4277,7 @@
     </w:p>
     <w:p>
       <w:r>
-        <w:t>Residents of Bengaluru in this sample rate the environmental benefits of green space highly (73.0/100) and its governance poorly (60.3). They endorse its ecological functions less strongly than its visible benefits, by about seven points in every class. Green-space class separates the seven types by access, with urban forest and grassland/scrub the least reached, and longer-term residents rate governance higher than newcomers. Age, gender and occupation did not matter, and most other apparent effects disappeared once we corrected for 36 tests. The practical message is narrow and specific: improve and display management first, widen access to the least-reached classes, and tell residents what the less visible functions are. A larger, population-weighted survey that records ward and income, and that links each class's perception to measured carbon and soil data, is the natural next step.</w:t>
+        <w:t>Residents in this sample prize what Bengaluru's green spaces do for the local environment (73.0/100) and think much less of how those spaces are run (60.3/100). They endorse the less visible ecological functions about seven points less firmly than the benefits they feel, and they do so in every class. Class separates the seven types mainly by access, with urban forest and grassland/scrub the hardest to reach. Long-term residents judge management more kindly than newcomers. Age, gender and occupation made no difference, and most other apparent effects vanished once 36 tests were corrected for. The policy message is short: maintain visibly, open up the least-reached classes, and explain the functions people can't see. A weighted citywide survey that records ward and income, and that links each class's perception score to measured carbon and soil data, is the obvious next step.</w:t>
       </w:r>
     </w:p>
     <w:p>
@@ -3081,7 +4329,7 @@
         <w:t>Data availability.</w:t>
       </w:r>
       <w:r>
-        <w:t xml:space="preserve"> The anonymised response file and the analysis script are available from the corresponding author on reasonable request. [CONFIRM; consider a repository deposit.]</w:t>
+        <w:t xml:space="preserve"> The anonymised responses and analysis scripts are available from the corresponding author on reasonable request. [CONFIRM; a repository deposit is preferable.]</w:t>
       </w:r>
     </w:p>
     <w:p>
@@ -3100,10 +4348,10 @@
         <w:rPr>
           <w:b/>
         </w:rPr>
-        <w:t>Declaration of generative AI use in the writing process.</w:t>
-      </w:r>
-      <w:r>
-        <w:t xml:space="preserve"> During the preparation of this work the authors used Claude (Anthropic) to write and run the analysis scripts and to draft and edit the manuscript text. The authors reviewed and edited the output and take full responsibility for the content of the publication. [CONFIRM]</w:t>
+        <w:t>Declaration of generative AI and AI-assisted technologies in the writing process.</w:t>
+      </w:r>
+      <w:r>
+        <w:t xml:space="preserve"> During the preparation of this work the authors used Claude (Anthropic) to write and run analysis scripts and to draft and edit the text. After using this tool, the authors reviewed and edited the content as needed and take full responsibility for the content of the publication. [CONFIRM]</w:t>
       </w:r>
     </w:p>
     <w:p>
@@ -3114,7 +4362,7 @@
         <w:t>Acknowledgements.</w:t>
       </w:r>
       <w:r>
-        <w:t xml:space="preserve"> The authors thank the 300 residents who answered the survey. [CONFIRM]</w:t>
+        <w:t xml:space="preserve"> We thank the 300 residents who gave their time to the survey. [CONFIRM]</w:t>
       </w:r>
     </w:p>
     <w:p>
@@ -3127,123 +4375,207 @@
     </w:p>
     <w:p>
       <w:r>
-        <w:rPr>
-          <w:i/>
-        </w:rPr>
-        <w:t>Reference status.</w:t>
-      </w:r>
-      <w:r>
-        <w:t xml:space="preserve"> Titles, years and journals for Thapa et al. (2024), Reyes-Riveros et al. (2021), Jim and Chen (2006) and Plieninger et al. (2022) were confirmed in this session against a scholarly database; the remaining entries are taken from the authors' synopsis reference list or standard methodological sources and must be checked against the publisher record (DOI, volume, pages) before submission.</w:t>
+        <w:t>Cronbach, L.J., 1951. Coefficient alpha and the internal structure of tests. Psychometrika 16(3), 297–334. https://doi.org/10.1007/BF02310555</w:t>
       </w:r>
     </w:p>
     <w:p>
       <w:r>
-        <w:t>Cronbach, L.J., 1951. Coefficient alpha and the internal structure of tests. Psychometrika 16(3), 297–334. https://doi.org/10.1007/BF02310555</w:t>
+        <w:t>Fornell, C., Larcker, D.F., 1981. Evaluating structural equation models with unobservable variables and measurement error. Journal of Marketing Research 18(1), 39–50. https://doi.org/10.2307/3151312</w:t>
       </w:r>
     </w:p>
     <w:p>
       <w:r>
-        <w:t>Fornell, C., Larcker, D.F., 1981. Evaluating structural equation models with unobservable variables and measurement error. Journal of Marketing Research 18(1), 39–50.</w:t>
+        <w:t>Fuller, R.A., Irvine, K.N., Devine-Wright, P., Warren, P.H., Gaston, K.J., 2007. Psychological benefits of greenspace increase with biodiversity. Biology Letters 3(4), 390–394. https://doi.org/10.1098/rsbl.2007.0149</w:t>
       </w:r>
     </w:p>
     <w:p>
       <w:r>
-        <w:t>Holm, S., 1979. A simple sequentially rejective multiple test procedure. Scandinavian Journal of Statistics 6(2), 65–70.</w:t>
+        <w:t>Gómez-Baggethun, E., Barton, D.N., 2013. Classifying and valuing ecosystem services for urban planning. Ecological Economics 86, 235–245. https://doi.org/10.1016/j.ecolecon.2012.08.019</w:t>
       </w:r>
     </w:p>
     <w:p>
       <w:r>
-        <w:t>Horn, J.L., 1965. A rationale and test for the number of factors in factor analysis. Psychometrika 30(2), 179–185.</w:t>
+        <w:t>Hartig, T., Mitchell, R., de Vries, S., Frumkin, H., 2014. Nature and health. Annual Review of Public Health 35, 207–228. https://doi.org/10.1146/annurev-publhealth-032013-182443</w:t>
       </w:r>
     </w:p>
     <w:p>
       <w:r>
-        <w:t>Hu, L., Bentler, P.M., 1999. Cutoff criteria for fit indexes in covariance structure analysis: Conventional criteria versus new alternatives. Structural Equation Modeling 6(1), 1–55.</w:t>
+        <w:t>Hayes, A.F., Coutts, J.J., 2020. Use omega rather than Cronbach's alpha for estimating reliability. But…. Communication Methods and Measures 14(1), 1–24. https://doi.org/10.1080/19312458.2020.1718629</w:t>
       </w:r>
     </w:p>
     <w:p>
       <w:r>
-        <w:t>Jim, C.Y., Chen, W.Y., 2006. Perception and attitude of residents toward urban green spaces in Guangzhou (China). Environmental Management 38(3), 338–349. https://doi.org/10.1007/s00267-005-0166-6</w:t>
+        <w:t>Henseler, J., Ringle, C.M., Sarstedt, M., 2015. A new criterion for assessing discriminant validity in variance-based structural equation modeling. Journal of the Academy of Marketing Science 43(1), 115–135. https://doi.org/10.1007/s11747-014-0403-8</w:t>
       </w:r>
     </w:p>
     <w:p>
       <w:r>
-        <w:t>Kaiser, H.F., 1974. An index of factorial simplicity. Psychometrika 39(1), 31–36.</w:t>
+        <w:t>Holm, S., 1979. A simple sequentially rejective multiple test procedure. Scandinavian Journal of Statistics 6(2), 65–70.</w:t>
       </w:r>
     </w:p>
     <w:p>
       <w:r>
-        <w:t>Kaplan, S., 1995. The restorative benefits of nature: Toward an integrative framework. Journal of Environmental Psychology 15(3), 169–182.</w:t>
+        <w:t>Horn, J.L., 1965. A rationale and test for the number of factors in factor analysis. Psychometrika 30(2), 179–185. https://doi.org/10.1007/BF02289447</w:t>
       </w:r>
     </w:p>
     <w:p>
       <w:r>
-        <w:t>Likert, R., 1932. A technique for the measurement of attitudes. Archives of Psychology 22(140), 5–55.</w:t>
+        <w:t>Hu, L., Bentler, P.M., 1999. Cutoff criteria for fit indexes in covariance structure analysis: Conventional criteria versus new alternatives. Structural Equation Modeling 6(1), 1–55. https://doi.org/10.1080/10705519909540118</w:t>
       </w:r>
     </w:p>
     <w:p>
       <w:r>
-        <w:t>Lo, A.Y.H., Jim, C.Y., 2010. Differential community effects on perception and use of urban greenspaces. Cities 27(6), 430–442. https://doi.org/10.1016/j.cities.2010.07.001</w:t>
+        <w:t>Jim, C.Y., Chen, W.Y., 2006. Perception and attitude of residents toward urban green spaces in Guangzhou (China). Environmental Management 38(3), 338–349. https://doi.org/10.1007/s00267-005-0166-6</w:t>
       </w:r>
     </w:p>
     <w:p>
       <w:r>
-        <w:t>Nagendra, H., Gopal, D., 2010. Street trees in Bangalore: Density, diversity, composition and distribution. Urban Forestry &amp; Urban Greening 9(2), 129–137. https://doi.org/10.1016/j.ufug.2009.12.005</w:t>
+        <w:t>Jim, C.Y., Shan, X., 2013. Socioeconomic effect on perception of urban green spaces in Guangzhou, China. Cities 31, 123–131. https://doi.org/10.1016/j.cities.2012.06.017</w:t>
       </w:r>
     </w:p>
     <w:p>
       <w:r>
-        <w:t>Nagendra, H., Nagendran, S., Paul, S., Pareeth, S., 2012. Graying, greening and fragmentation in the rapidly expanding Indian city of Bangalore. Landscape and Urban Planning 105(4), 400–406. https://doi.org/10.1016/j.landurbplan.2012.01.014</w:t>
+        <w:t>Kabisch, N., Haase, D., 2014. Green justice or just green? Provision of urban green spaces in Berlin, Germany. Landscape and Urban Planning 122, 129–139. https://doi.org/10.1016/j.landurbplan.2013.11.016</w:t>
       </w:r>
     </w:p>
     <w:p>
       <w:r>
-        <w:t>Norman, G., 2010. Likert scales, levels of measurement and the "laws" of statistics. Advances in Health Sciences Education 15(5), 625–632.</w:t>
+        <w:t>Kaiser, H.F., 1974. An index of factorial simplicity. Psychometrika 39(1), 31–36. https://doi.org/10.1007/BF02291575</w:t>
       </w:r>
     </w:p>
     <w:p>
       <w:r>
-        <w:t>Plieninger, T., et al., 2022. Disentangling ecosystem services perceptions from blue infrastructure around a rapidly expanding megacity. Landscape and Urban Planning. [volume/pages to be completed]</w:t>
+        <w:t>Kaplan, S., 1995. The restorative benefits of nature: Toward an integrative framework. Journal of Environmental Psychology 15(3), 169–182. https://doi.org/10.1016/0272-4944(95)90001-2</w:t>
       </w:r>
     </w:p>
     <w:p>
       <w:r>
-        <w:t>Podsakoff, P.M., MacKenzie, S.B., Lee, J.-Y., Podsakoff, N.P., 2003. Common method biases in behavioral research: A critical review of the literature and recommended remedies. Journal of Applied Psychology 88(5), 879–903.</w:t>
+        <w:t>Kothencz, G., Blaschke, T., 2017. Urban parks: Visitors' perceptions versus spatial indicators. Land Use Policy 64, 233–244. https://doi.org/10.1016/j.landusepol.2017.02.012</w:t>
       </w:r>
     </w:p>
     <w:p>
       <w:r>
-        <w:t>Ramachandra, T.V., Bharath, A.H., Sowmyashree, M.V., 2015. Monitoring urbanization and its implications in a mega city from space: Spatiotemporal patterns and its indicators. Journal of Environmental Management 148, 67–81.</w:t>
+        <w:t>Kothencz, G., Kolcsár, R., Cabrera-Barona, P., Szilassi, P., 2017. Urban green space perception and its contribution to well-being. International Journal of Environmental Research and Public Health 14(7), 766. https://doi.org/10.3390/ijerph14070766</w:t>
       </w:r>
     </w:p>
     <w:p>
       <w:r>
-        <w:t>Reyes-Riveros, R., Altamirano, A., De La Barrera, F., Rozas-Vasquez, D., Vieli, L., Meli, P., 2021. Linking public urban green spaces and human well-being: A systematic review. Urban Forestry &amp; Urban Greening 61, 127105.</w:t>
+        <w:t>Lee, A.C.K., Maheswaran, R., 2011. The health benefits of urban green spaces: A review of the evidence. Journal of Public Health 33(2), 212–222.</w:t>
       </w:r>
     </w:p>
     <w:p>
       <w:r>
-        <w:t>Taylor, L., Hochuli, D.F., 2017. Defining greenspace: Multiple uses across multiple meanings. Landscape and Urban Planning 158, 25–38. https://doi.org/10.1016/j.landurbplan.2016.09.024</w:t>
+        <w:t>Likert, R., 1932. A technique for the measurement of attitudes. Archives of Psychology 22(140), 1–55.</w:t>
       </w:r>
     </w:p>
     <w:p>
       <w:r>
-        <w:t>Thapa, P., Torralba, M., Nolke, N., Chappell, M., Wangchuk, S., Kleinn, C., 2024. Disentangling associations of human wellbeing with green infrastructure, degree of urbanity, and social factors around an Asian megacity. Landscape Ecology 39, 68.</w:t>
+        <w:t>Lo, A.Y.H., Jim, C.Y., 2010. Differential community effects on perception and use of urban greenspaces. Cities 27(6), 430–442. https://doi.org/10.1016/j.cities.2010.07.001</w:t>
       </w:r>
     </w:p>
     <w:p>
       <w:r>
-        <w:t>Tomczak, M., Tomczak, E., 2014. The need to report effect size estimates revisited: An overview of some recommended measures of effect size. Trends in Sport Sciences 21(1), 19–25.</w:t>
+        <w:t>Markevych, I., Schoierer, J., Hartig, T., Chudnovsky, A., Hystad, P., Dzhambov, A.M., et al., 2017. Exploring pathways linking greenspace to health: Theoretical and methodological guidance. Environmental Research 158, 301–317. https://doi.org/10.1016/j.envres.2017.06.028</w:t>
       </w:r>
     </w:p>
     <w:p>
       <w:r>
-        <w:t>Ulrich, R.S., Simons, R.F., Losito, B.D., Fiorito, E., Miles, M.A., Zelson, M., 1991. Stress recovery during exposure to natural and urban environments. Journal of Environmental Psychology 11(3), 201–230.</w:t>
+        <w:t>Nagendra, H., Gopal, D., 2010. Street trees in Bangalore: Density, diversity, composition and distribution. Urban Forestry &amp; Urban Greening 9(2), 129–137. https://doi.org/10.1016/j.ufug.2009.12.005</w:t>
       </w:r>
     </w:p>
     <w:p>
       <w:r>
-        <w:t>Wolch, J.R., Byrne, J., Newell, J.P., 2014. Urban green space, public health, and environmental justice: The challenge of making cities "just green enough". Landscape and Urban Planning 125, 234–244.</w:t>
+        <w:t>Nagendra, H., Gopal, D., 2011. Tree diversity, distribution, history and change in urban parks: Studies in Bangalore, India. Urban Ecosystems 14, 211–223. https://doi.org/10.1007/s11252-010-0148-1</w:t>
+      </w:r>
+    </w:p>
+    <w:p>
+      <w:r>
+        <w:t>Nagendra, H., Nagendran, S., Paul, S., Pareeth, S., 2012. Graying, greening and fragmentation in the rapidly expanding Indian city of Bangalore. Landscape and Urban Planning 105(4), 400–406. https://doi.org/10.1016/j.landurbplan.2012.01.014</w:t>
+      </w:r>
+    </w:p>
+    <w:p>
+      <w:r>
+        <w:t>Norman, G., 2010. Likert scales, levels of measurement and the "laws" of statistics. Advances in Health Sciences Education 15(5), 625–632. https://doi.org/10.1007/s10459-010-9222-y</w:t>
+      </w:r>
+    </w:p>
+    <w:p>
+      <w:r>
+        <w:t>Plieninger, T., Thapa, P., Bhaskar, D., Nagendra, H., Torralba, M., Zoderer, B.M., 2022. Disentangling ecosystem services perceptions from blue infrastructure around a rapidly expanding megacity. Landscape and Urban Planning 222, 104399. https://doi.org/10.1016/j.landurbplan.2022.104399</w:t>
+      </w:r>
+    </w:p>
+    <w:p>
+      <w:r>
+        <w:t>Podsakoff, P.M., MacKenzie, S.B., Lee, J.-Y., Podsakoff, N.P., 2003. Common method biases in behavioral research: A critical review of the literature and recommended remedies. Journal of Applied Psychology 88(5), 879–903. https://doi.org/10.1037/0021-9010.88.5.879</w:t>
+      </w:r>
+    </w:p>
+    <w:p>
+      <w:r>
+        <w:t>Reyes-Riveros, R., Altamirano, A., De La Barrera, F., Rozas-Vásquez, D., Vieli, L., Meli, P., 2021. Linking public urban green spaces and human well-being: A systematic review. Urban Forestry &amp; Urban Greening 61, 127105.</w:t>
+      </w:r>
+    </w:p>
+    <w:p>
+      <w:r>
+        <w:t>Rigolon, A., 2016. A complex landscape of inequity in access to urban parks: A literature review. Landscape and Urban Planning 153, 160–169. https://doi.org/10.1016/j.landurbplan.2016.05.017</w:t>
+      </w:r>
+    </w:p>
+    <w:p>
+      <w:r>
+        <w:t>Schipperijn, J., Ekholm, O., Stigsdotter, U.K., Toftager, M., Bentsen, P., Kamper-Jørgensen, F., Randrup, T.B., 2010. Factors influencing the use of green space: Results from a Danish national representative survey. Landscape and Urban Planning 95(3), 130–137.</w:t>
+      </w:r>
+    </w:p>
+    <w:p>
+      <w:r>
+        <w:t>Shah, A., Garg, A., Mishra, V., 2021. Quantifying the local cooling effects of urban green spaces: Evidence from Bengaluru, India. Landscape and Urban Planning 209, 104043.</w:t>
+      </w:r>
+    </w:p>
+    <w:p>
+      <w:r>
+        <w:t>Shanahan, D.F., Bush, R., Gaston, K.J., Lin, B.B., Dean, J., Barber, E., Fuller, R.A., 2016. Health benefits from nature experiences depend on dose. Scientific Reports 6, 28551. https://doi.org/10.1038/srep28551</w:t>
+      </w:r>
+    </w:p>
+    <w:p>
+      <w:r>
+        <w:t>Sreetheran, M., van den Bosch, C.C.K., 2014. A socio-ecological exploration of fear of crime in urban green spaces – A systematic review. Urban Forestry &amp; Urban Greening 13(1), 1–18.</w:t>
+      </w:r>
+    </w:p>
+    <w:p>
+      <w:r>
+        <w:t>Taylor, L., Hochuli, D.F., 2017. Defining greenspace: Multiple uses across multiple disciplines. Landscape and Urban Planning 158, 25–38. https://doi.org/10.1016/j.landurbplan.2016.09.024</w:t>
+      </w:r>
+    </w:p>
+    <w:p>
+      <w:r>
+        <w:t>Thapa, P., Torralba, M., Nölke, N., Chappell, M., Wangchuk, S., Kleinn, C., 2024. Disentangling associations of human wellbeing with green infrastructure, degree of urbanity, and social factors around an Asian megacity. Landscape Ecology 39, 68.</w:t>
+      </w:r>
+    </w:p>
+    <w:p>
+      <w:r>
+        <w:t>Tomczak, M., Tomczak, E., 2014. The need to report effect size estimates revisited. An overview of some recommended measures of effect size. Trends in Sport Sciences 21(1), 19–25.</w:t>
+      </w:r>
+    </w:p>
+    <w:p>
+      <w:r>
+        <w:t>Ulrich, R.S., Simons, R.F., Losito, B.D., Fiorito, E., Miles, M.A., Zelson, M., 1991. Stress recovery during exposure to natural and urban environments. Journal of Environmental Psychology 11(3), 201–230. https://doi.org/10.1016/S0272-4944(05)80184-7</w:t>
+      </w:r>
+    </w:p>
+    <w:p>
+      <w:r>
+        <w:t>Vailshery, L.S., Jaganmohan, M., Nagendra, H., 2013. Effect of street trees on microclimate and air pollution in a tropical city. Urban Forestry &amp; Urban Greening 12, 408–415.</w:t>
+      </w:r>
+    </w:p>
+    <w:p>
+      <w:r>
+        <w:t>White, M.P., Alcock, I., Grellier, J., Wheeler, B.W., Hartig, T., Warber, S.L., et al., 2019. Spending at least 120 minutes a week in nature is associated with good health and wellbeing. Scientific Reports 9, 7730. https://doi.org/10.1038/s41598-019-44097-3</w:t>
+      </w:r>
+    </w:p>
+    <w:p>
+      <w:r>
+        <w:t>Wolch, J.R., Byrne, J., Newell, J.P., 2014. Urban green space, public health, and environmental justice: The challenge of making cities 'just green enough'. Landscape and Urban Planning 125, 234–244. https://doi.org/10.1016/j.landurbplan.2014.01.017</w:t>
+      </w:r>
+    </w:p>
+    <w:p>
+      <w:r>
+        <w:t>Zhou, K., Tan, R., 2024. Understanding the structure of public perceptions towards urban green spaces: A mixed-method investigation. Urban Forestry &amp; Urban Greening 101, 128496. https://doi.org/10.1016/j.ufug.2024.128496</w:t>
       </w:r>
     </w:p>
     <w:p>
@@ -3251,7 +4583,7 @@
         <w:pStyle w:val="Heading1"/>
       </w:pPr>
       <w:r>
-        <w:t>Supplementary material (to be uploaded with the submission)</w:t>
+        <w:t>Supplementary material</w:t>
       </w:r>
     </w:p>
     <w:p>
@@ -3265,7 +4597,7 @@
         <w:t>Table S1.</w:t>
       </w:r>
       <w:r>
-        <w:t xml:space="preserve"> Full questionnaire (35 items, English; Kannada version).</w:t>
+        <w:t xml:space="preserve"> Full questionnaire (English and Kannada).</w:t>
       </w:r>
     </w:p>
     <w:p>
@@ -3279,7 +4611,7 @@
         <w:t>Table S2.</w:t>
       </w:r>
       <w:r>
-        <w:t xml:space="preserve"> Item descriptives (mean, SD, % agree/neutral/disagree, skewness): `t_items.csv`.</w:t>
+        <w:t xml:space="preserve"> Item descriptives: `t_items.csv`.</w:t>
       </w:r>
     </w:p>
     <w:p>
@@ -3307,7 +4639,7 @@
         <w:t>Table S4.</w:t>
       </w:r>
       <w:r>
-        <w:t xml:space="preserve"> All 36 group tests (H, df, raw and Holm </w:t>
+        <w:t xml:space="preserve"> All 36 group tests with raw and Holm </w:t>
       </w:r>
       <w:r>
         <w:rPr>
@@ -3316,7 +4648,7 @@
         <w:t>p</w:t>
       </w:r>
       <w:r>
-        <w:t>, ε²): `t_group_tests.csv`.</w:t>
+        <w:t>-values: `t_group_tests.csv`.</w:t>
       </w:r>
     </w:p>
     <w:p>
@@ -3330,7 +4662,7 @@
         <w:t>Table S5.</w:t>
       </w:r>
       <w:r>
-        <w:t xml:space="preserve"> Appreciation–awareness gap by class: `t_gap_by_class.csv`.</w:t>
+        <w:t xml:space="preserve"> Salience gap by class: `t_gap_by_class.csv`.</w:t>
       </w:r>
     </w:p>
     <w:p>
@@ -3341,10 +4673,10 @@
         <w:rPr>
           <w:b/>
         </w:rPr>
-        <w:t>Fig. S1.</w:t>
-      </w:r>
-      <w:r>
-        <w:t xml:space="preserve"> Scree plot with parallel-analysis benchmark: `figs/figS1_scree.png`.</w:t>
+        <w:t>Table S6.</w:t>
+      </w:r>
+      <w:r>
+        <w:t xml:space="preserve"> HTMT matrix and model comparisons: `validity_extra.json`.</w:t>
       </w:r>
     </w:p>
     <w:p>
@@ -3355,10 +4687,24 @@
         <w:rPr>
           <w:b/>
         </w:rPr>
+        <w:t>Fig. S1.</w:t>
+      </w:r>
+      <w:r>
+        <w:t xml:space="preserve"> Scree plot with parallel-analysis benchmark: `figs/figS1_scree.png`.</w:t>
+      </w:r>
+    </w:p>
+    <w:p>
+      <w:pPr>
+        <w:pStyle w:val="ListBullet"/>
+      </w:pPr>
+      <w:r>
+        <w:rPr>
+          <w:b/>
+        </w:rPr>
         <w:t>Code.</w:t>
       </w:r>
       <w:r>
-        <w:t xml:space="preserve"> `analysis.py` (reproduces all numbers and figures).</w:t>
+        <w:t xml:space="preserve"> `analysis.py`, `validity_extra.py`.</w:t>
       </w:r>
     </w:p>
     <w:sectPr>

</xml_diff>

<commit_message>
Obj4 manuscript: add fieldwork period and data-collection mode split
Co-Authored-By: Claude Opus 5.5 <noreply@anthropic.com>
Claude-Session: https://claude.ai/code/session_011ijdXe2nvHH3sMWrXWSiXn
</commit_message>
<xml_diff>
--- a/output/obj4/Obj4_Perception_manuscript.docx
+++ b/output/obj4/Obj4_Perception_manuscript.docx
@@ -139,7 +139,7 @@
         <w:t>d</w:t>
       </w:r>
       <w:r>
-        <w:t>z = 0.42), a gap that appeared in every class. Of 36 group comparisons, two survived Holm correction. Class shaped usage and access (ε² = 0.077), with urban forest and grassland/scrub the least reached. Longer residence went with higher governance ratings (ε² = 0.050). Age, gender and occupation showed no effect. The results point to visible management and better access, not persuasion, as the levers that would most change how residents experience the city's green space. The quota sample and cross-sectional design limit generalisation.</w:t>
+        <w:t>z = 0.42), a gap that appeared in every class. Of 36 group comparisons, two survived Holm correction. Class shaped usage and access (ε² = 0.077), with urban forest and grassland/scrub the least reached. Longer residence went with higher governance ratings (ε² = 0.050). Age, gender and occupation showed no effect. The results point to visible management and better access, not persuasion, as the levers that would most change how residents experience the city's green space. The quota sample and cross-sectional design (2022–2024) limit generalisation.</w:t>
       </w:r>
     </w:p>
     <w:p>
@@ -441,7 +441,7 @@
     </w:p>
     <w:p>
       <w:r>
-        <w:t>Length of residence and class were not controlled; they reflect who took part and what they chose. The first author collected all 300 responses in person, either through Google Forms or in face-to-face interviews, in which the author read out the items and recorded the answers. Respondents chose the mode and the language. No enumerators were used. [CONFIRM: online/interview split, how quotas were filled, fieldwork period.]</w:t>
+        <w:t>Length of residence and class were not controlled; they reflect who took part and what they chose. Fieldwork ran from 2022 to 2024. The first author collected all 300 responses without enumerators: 210 (70%) through an online questionnaire on Google Forms and 90 (30%) in face-to-face field interviews, in which the author read out the items and recorded the answers. Respondents chose the mode and the language. [CONFIRM: how the quotas were filled.]</w:t>
       </w:r>
     </w:p>
     <w:p>
@@ -459,7 +459,7 @@
     </w:p>
     <w:p>
       <w:r>
-        <w:t>Participation was voluntary and anonymous. The consent statement came first, and no names, contact details or other identifiers were recorded. The items covered opinions about green space and broad demographic categories, with no sensitive, health or personal-history questions. Formal approval from an institutional ethics committee was not sought. [CONFIRM against journal policy; an institutional exemption letter is advisable.]</w:t>
+        <w:t>Participation was voluntary and anonymous. The consent statement came first, and no names, contact details or other identifiers were recorded. The items covered opinions about green space and broad demographic categories, with no sensitive, health or personal-history questions. Formal approval from an institutional ethics committee was not sought, because the survey collected no identifying or sensitive information. [ETHICS: authors to add exemption or approval details.]</w:t>
       </w:r>
     </w:p>
     <w:p>

</xml_diff>